<commit_message>
Resume copy: plain declarative sentences, no em-dashes, one claim per bullet
</commit_message>
<xml_diff>
--- a/public/Eric_Gitangu_Resume.docx
+++ b/public/Eric_Gitangu_Resume.docx
@@ -26,7 +26,7 @@
           <w:sz w:val="22"/>
           <w:szCs w:val="22"/>
         </w:rPr>
-        <w:t xml:space="preserve">Software Engineer — Payments Platforms, Distributed Systems &amp; Security Architecture</w:t>
+        <w:t xml:space="preserve">Software Engineer, Payments Platforms and Distributed Systems</w:t>
       </w:r>
     </w:p>
     <w:p>
@@ -41,7 +41,7 @@
         </w:rPr>
         <w:t xml:space="preserve">Nairobi, Kenya · </w:t>
       </w:r>
-      <w:hyperlink w:history="1" r:id="rIdd9kcnkggtpzpexdh3cto8">
+      <w:hyperlink w:history="1" r:id="rIde8jx3ytzs9kso2cs40zv7">
         <w:r>
           <w:rPr>
             <w:color w:val="1A4EA3"/>
@@ -60,7 +60,7 @@
         </w:rPr>
         <w:t xml:space="preserve"> · +254 708 078 997 · </w:t>
       </w:r>
-      <w:hyperlink w:history="1" r:id="rIdoqzmwevt7arouk4tjipve">
+      <w:hyperlink w:history="1" r:id="rIdvqscbe3pkoz5fnm260zeu">
         <w:r>
           <w:rPr>
             <w:color w:val="1A4EA3"/>
@@ -79,7 +79,7 @@
         </w:rPr>
         <w:t xml:space="preserve"> · </w:t>
       </w:r>
-      <w:hyperlink w:history="1" r:id="rId8qq4msuregdzziylavpsh">
+      <w:hyperlink w:history="1" r:id="rIdqpqo8t7avzvq93zrgi85r">
         <w:r>
           <w:rPr>
             <w:color w:val="1A4EA3"/>
@@ -118,7 +118,7 @@
           <w:sz w:val="19"/>
           <w:szCs w:val="19"/>
         </w:rPr>
-        <w:t xml:space="preserve">Software engineer with 11+ years designing, shipping and operating distributed, mission-critical systems — the last five in African fintech, mobility and energy access, where the systems move real money. Currently own platform architecture and data security for a mobility/fintech platform: five product surfaces and a mobile API behind one backend-for-frontend, 6,800+ unit tests, 280+ architecture decision records, an atomic release rail with automatic rollback, and card and mobile-money rails (Mastercard MPGS, M-Pesa, MTN, Tigo) built to PCI DSS SAQ-A scope with idempotent, fail-closed money paths. Earlier: CI/CD and quality gates for a PAYG solar platform across seven markets, an ML-security platform for medical-device software, and a digital-addressing pilot with a county government. Polyglot across TypeScript/Node.js, Java/Spring Boot, PHP, Python, Rust, Go and C#/.NET; deep in event-driven architecture, resiliency and fault-tolerance patterns, public cloud and containers, observability and secure SDLC. Set architecture direction across teams, mentor engineers (15+), and stay in production code every day.</w:t>
+        <w:t xml:space="preserve">Software engineer with 11 years in production systems, the last five in African fintech, mobility and energy access. I currently own platform architecture and data security for a mobility and payments company: five web applications and a mobile API on one backend, 6,800 unit tests, 280 architecture decision records, an atomic release process with automatic rollback, and card and mobile money integrations (Mastercard Payment Gateway Services, M-Pesa, MTN, Tigo) built within PCI DSS SAQ-A scope. Before that I ran CI/CD and test automation for a pay-as-you-go solar platform in seven countries, founded an ML security company for medical device software, and led a digital addressing pilot with a county government. I work in TypeScript, Java, PHP, Python, Rust, Go and C#. I design event-driven systems, plan for failure, and instrument what I ship. I set technical direction for the team, review code daily, and have mentored 15 engineers.</w:t>
       </w:r>
     </w:p>
     <w:p>
@@ -150,7 +150,7 @@
           <w:sz w:val="21"/>
           <w:szCs w:val="21"/>
         </w:rPr>
-        <w:t xml:space="preserve">Senior Full Stack Engineer — Platform Architecture &amp; Data Security — Moovn Technologies</w:t>
+        <w:t xml:space="preserve">Senior Full Stack Engineer, Platform Architecture and Data Security, Moovn Technologies</w:t>
       </w:r>
       <w:r>
         <w:rPr>
@@ -172,109 +172,109 @@
           <w:sz w:val="19"/>
           <w:szCs w:val="19"/>
         </w:rPr>
-        <w:t xml:space="preserve">Own architecture and data security for a mobility/fintech platform serving riders, drivers, corporates and partners across East and Southern Africa.</w:t>
-      </w:r>
-    </w:p>
-    <w:p>
-      <w:pPr>
-        <w:pStyle w:val="ListParagraph"/>
-        <w:numPr>
-          <w:ilvl w:val="0"/>
-          <w:numId w:val="1"/>
-        </w:numPr>
-        <w:spacing w:after="30"/>
-      </w:pPr>
-      <w:r>
-        <w:rPr>
-          <w:sz w:val="19"/>
-          <w:szCs w:val="19"/>
-        </w:rPr>
-        <w:t xml:space="preserve">Own the architecture of a money-moving platform: five Next.js surfaces and a mobile API behind one backend-for-frontend on a PHP monolith — 6,800+ unit tests and 280+ architecture decision records governing every change.</w:t>
-      </w:r>
-    </w:p>
-    <w:p>
-      <w:pPr>
-        <w:pStyle w:val="ListParagraph"/>
-        <w:numPr>
-          <w:ilvl w:val="0"/>
-          <w:numId w:val="1"/>
-        </w:numPr>
-        <w:spacing w:after="30"/>
-      </w:pPr>
-      <w:r>
-        <w:rPr>
-          <w:sz w:val="19"/>
-          <w:szCs w:val="19"/>
-        </w:rPr>
-        <w:t xml:space="preserve">Designed and operate the atomic release rail: immutable releases activated by a symlink flip, a post-flip smoke that decides healthy / roll back, a release guard on money-path files, and detached self-logging deploys — one command, under a minute, one-command rollback.</w:t>
-      </w:r>
-    </w:p>
-    <w:p>
-      <w:pPr>
-        <w:pStyle w:val="ListParagraph"/>
-        <w:numPr>
-          <w:ilvl w:val="0"/>
-          <w:numId w:val="1"/>
-        </w:numPr>
-        <w:spacing w:after="30"/>
-      </w:pPr>
-      <w:r>
-        <w:rPr>
-          <w:sz w:val="19"/>
-          <w:szCs w:val="19"/>
-        </w:rPr>
-        <w:t xml:space="preserve">Built card and mobile-money rails to PCI DSS SAQ-A scope: Mastercard Payment Gateway Services hosted sessions (card data never touches our servers), M-Pesa Daraja STK and B2C, MTN and Tigo — locality-locked rail resolution, fail-closed idempotency, signed and IP-allow-listed settlement callbacks.</w:t>
-      </w:r>
-    </w:p>
-    <w:p>
-      <w:pPr>
-        <w:pStyle w:val="ListParagraph"/>
-        <w:numPr>
-          <w:ilvl w:val="0"/>
-          <w:numId w:val="1"/>
-        </w:numPr>
-        <w:spacing w:after="30"/>
-      </w:pPr>
-      <w:r>
-        <w:rPr>
-          <w:sz w:val="19"/>
-          <w:szCs w:val="19"/>
-        </w:rPr>
-        <w:t xml:space="preserve">Designed a cross-product trust-score engine: HMAC-signed idempotent event ingestion from partner products, a tamper-evident hash-chained ledger, a budget-guarded nightly recompute over ~40,000 users, and a flag-gated phased rollout across admin, rider portal and mobile.</w:t>
-      </w:r>
-    </w:p>
-    <w:p>
-      <w:pPr>
-        <w:pStyle w:val="ListParagraph"/>
-        <w:numPr>
-          <w:ilvl w:val="0"/>
-          <w:numId w:val="1"/>
-        </w:numPr>
-        <w:spacing w:after="30"/>
-      </w:pPr>
-      <w:r>
-        <w:rPr>
-          <w:sz w:val="19"/>
-          <w:szCs w:val="19"/>
-        </w:rPr>
-        <w:t xml:space="preserve">Raised security posture end to end: key-only SSH with fail2ban, WebAuthn/TOTP MFA and reserved admin rights, audit hash-chains, gitleaks and blocking test gates in git hooks, purple-team pentest remediation, encrypted nightly off-box backups with restore drills.</w:t>
-      </w:r>
-    </w:p>
-    <w:p>
-      <w:pPr>
-        <w:pStyle w:val="ListParagraph"/>
-        <w:numPr>
-          <w:ilvl w:val="0"/>
-          <w:numId w:val="1"/>
-        </w:numPr>
-        <w:spacing w:after="30"/>
-      </w:pPr>
-      <w:r>
-        <w:rPr>
-          <w:sz w:val="19"/>
-          <w:szCs w:val="19"/>
-        </w:rPr>
-        <w:t xml:space="preserve">Instrumented a legacy application with Prometheus, Grafana and Loki without coupling app code; root-caused a failover storm to a mis-sequenced reboot. Author the team's release and deploy standards; mentor through structured review.</w:t>
+        <w:t xml:space="preserve">Platform architecture and data security for a mobility and payments company operating in East and Southern Africa.</w:t>
+      </w:r>
+    </w:p>
+    <w:p>
+      <w:pPr>
+        <w:pStyle w:val="ListParagraph"/>
+        <w:numPr>
+          <w:ilvl w:val="0"/>
+          <w:numId w:val="1"/>
+        </w:numPr>
+        <w:spacing w:after="30"/>
+      </w:pPr>
+      <w:r>
+        <w:rPr>
+          <w:sz w:val="19"/>
+          <w:szCs w:val="19"/>
+        </w:rPr>
+        <w:t xml:space="preserve">Own the architecture of five web applications and a mobile API served from one PHP backend. The codebase carries 6,800 unit tests and 280 architecture decision records.</w:t>
+      </w:r>
+    </w:p>
+    <w:p>
+      <w:pPr>
+        <w:pStyle w:val="ListParagraph"/>
+        <w:numPr>
+          <w:ilvl w:val="0"/>
+          <w:numId w:val="1"/>
+        </w:numPr>
+        <w:spacing w:after="30"/>
+      </w:pPr>
+      <w:r>
+        <w:rPr>
+          <w:sz w:val="19"/>
+          <w:szCs w:val="19"/>
+        </w:rPr>
+        <w:t xml:space="preserve">Designed the release process. Each release is an immutable directory activated by a symlink flip. A post-flip smoke test rolls back automatically on a real error. Deploy is one command and finishes in under a minute; rollback is one command.</w:t>
+      </w:r>
+    </w:p>
+    <w:p>
+      <w:pPr>
+        <w:pStyle w:val="ListParagraph"/>
+        <w:numPr>
+          <w:ilvl w:val="0"/>
+          <w:numId w:val="1"/>
+        </w:numPr>
+        <w:spacing w:after="30"/>
+      </w:pPr>
+      <w:r>
+        <w:rPr>
+          <w:sz w:val="19"/>
+          <w:szCs w:val="19"/>
+        </w:rPr>
+        <w:t xml:space="preserve">Built the card top-up rail on Mastercard Payment Gateway Services hosted sessions, so card data never reaches our servers, keeping the platform in PCI DSS SAQ-A scope. Built M-Pesa STK and B2C, MTN and Tigo mobile money rails with per-country routing and idempotency that fails closed.</w:t>
+      </w:r>
+    </w:p>
+    <w:p>
+      <w:pPr>
+        <w:pStyle w:val="ListParagraph"/>
+        <w:numPr>
+          <w:ilvl w:val="0"/>
+          <w:numId w:val="1"/>
+        </w:numPr>
+        <w:spacing w:after="30"/>
+      </w:pPr>
+      <w:r>
+        <w:rPr>
+          <w:sz w:val="19"/>
+          <w:szCs w:val="19"/>
+        </w:rPr>
+        <w:t xml:space="preserve">Designed a trust score engine that ingests signed, idempotent events from partner products into a hash-chained ledger and recomputes scores nightly for 40,000 users. Rolled it out behind feature flags to the admin console, rider portal and mobile API.</w:t>
+      </w:r>
+    </w:p>
+    <w:p>
+      <w:pPr>
+        <w:pStyle w:val="ListParagraph"/>
+        <w:numPr>
+          <w:ilvl w:val="0"/>
+          <w:numId w:val="1"/>
+        </w:numPr>
+        <w:spacing w:after="30"/>
+      </w:pPr>
+      <w:r>
+        <w:rPr>
+          <w:sz w:val="19"/>
+          <w:szCs w:val="19"/>
+        </w:rPr>
+        <w:t xml:space="preserve">Hardened access and change control: key-only SSH with fail2ban, WebAuthn and TOTP MFA for admins, secret scanning and test gates in git hooks, pentest remediation, and encrypted nightly off-site database backups with restore drills.</w:t>
+      </w:r>
+    </w:p>
+    <w:p>
+      <w:pPr>
+        <w:pStyle w:val="ListParagraph"/>
+        <w:numPr>
+          <w:ilvl w:val="0"/>
+          <w:numId w:val="1"/>
+        </w:numPr>
+        <w:spacing w:after="30"/>
+      </w:pPr>
+      <w:r>
+        <w:rPr>
+          <w:sz w:val="19"/>
+          <w:szCs w:val="19"/>
+        </w:rPr>
+        <w:t xml:space="preserve">Added Prometheus, Grafana and Loki to a legacy application without changing application code. Traced a database failover storm to a mis-sequenced reboot and fixed the liveness checks. Wrote the team's release and deployment guides.</w:t>
       </w:r>
     </w:p>
     <w:p>
@@ -311,7 +311,7 @@
           <w:sz w:val="21"/>
           <w:szCs w:val="21"/>
         </w:rPr>
-        <w:t xml:space="preserve">Team Lead — QA &amp; Engineering — Ignite Energy Access (formerly ENGIE Energy Access)</w:t>
+        <w:t xml:space="preserve">Team Lead, QA and Engineering, Ignite Energy Access (formerly ENGIE Energy Access)</w:t>
       </w:r>
       <w:r>
         <w:rPr>
@@ -333,75 +333,75 @@
           <w:sz w:val="19"/>
           <w:szCs w:val="19"/>
         </w:rPr>
-        <w:t xml:space="preserve">Owned CI/CD and quality infrastructure for a PAYG solar platform across seven African markets.</w:t>
-      </w:r>
-    </w:p>
-    <w:p>
-      <w:pPr>
-        <w:pStyle w:val="ListParagraph"/>
-        <w:numPr>
-          <w:ilvl w:val="0"/>
-          <w:numId w:val="1"/>
-        </w:numPr>
-        <w:spacing w:after="30"/>
-      </w:pPr>
-      <w:r>
-        <w:rPr>
-          <w:sz w:val="19"/>
-          <w:szCs w:val="19"/>
-        </w:rPr>
-        <w:t xml:space="preserve">Owned end-to-end CI/CD and QA infrastructure across seven markets (Kenya, Uganda, Tanzania, Rwanda, Mozambique, Côte d'Ivoire, Zambia) — testing standards, release gates and deployment workflows adopted across engineering.</w:t>
-      </w:r>
-    </w:p>
-    <w:p>
-      <w:pPr>
-        <w:pStyle w:val="ListParagraph"/>
-        <w:numPr>
-          <w:ilvl w:val="0"/>
-          <w:numId w:val="1"/>
-        </w:numPr>
-        <w:spacing w:after="30"/>
-      </w:pPr>
-      <w:r>
-        <w:rPr>
-          <w:sz w:val="19"/>
-          <w:szCs w:val="19"/>
-        </w:rPr>
-        <w:t xml:space="preserve">Built automated end-to-end suites (Playwright, Cypress) over payment processing, token generation, subscriptions and IoT provisioning; moved regression from multi-day manual cycles to automated runs on every pull request.</w:t>
-      </w:r>
-    </w:p>
-    <w:p>
-      <w:pPr>
-        <w:pStyle w:val="ListParagraph"/>
-        <w:numPr>
-          <w:ilvl w:val="0"/>
-          <w:numId w:val="1"/>
-        </w:numPr>
-        <w:spacing w:after="30"/>
-      </w:pPr>
-      <w:r>
-        <w:rPr>
-          <w:sz w:val="19"/>
-          <w:szCs w:val="19"/>
-        </w:rPr>
-        <w:t xml:space="preserve">Led the Rails 5 to 7.2 upgrade across the payment, PAYG token, IoT diagnostics, subscription and OTA firmware systems, spanning multi-tenant configurations for multiple markets.</w:t>
-      </w:r>
-    </w:p>
-    <w:p>
-      <w:pPr>
-        <w:pStyle w:val="ListParagraph"/>
-        <w:numPr>
-          <w:ilvl w:val="0"/>
-          <w:numId w:val="1"/>
-        </w:numPr>
-        <w:spacing w:after="30"/>
-      </w:pPr>
-      <w:r>
-        <w:rPr>
-          <w:sz w:val="19"/>
-          <w:szCs w:val="19"/>
-        </w:rPr>
-        <w:t xml:space="preserve">Designed asynchronous token generation (RabbitMQ) and a Redshift payment-event pipeline, removing synchronous bottlenecks under peak billing load; led and grew a team of QA engineers.</w:t>
+        <w:t xml:space="preserve">CI/CD and test automation for a pay-as-you-go solar platform in seven countries.</w:t>
+      </w:r>
+    </w:p>
+    <w:p>
+      <w:pPr>
+        <w:pStyle w:val="ListParagraph"/>
+        <w:numPr>
+          <w:ilvl w:val="0"/>
+          <w:numId w:val="1"/>
+        </w:numPr>
+        <w:spacing w:after="30"/>
+      </w:pPr>
+      <w:r>
+        <w:rPr>
+          <w:sz w:val="19"/>
+          <w:szCs w:val="19"/>
+        </w:rPr>
+        <w:t xml:space="preserve">Owned CI/CD pipelines and test infrastructure for Kenya, Uganda, Tanzania, Rwanda, Mozambique, Côte d'Ivoire and Zambia. Defined the testing standards and release gates engineering adopted.</w:t>
+      </w:r>
+    </w:p>
+    <w:p>
+      <w:pPr>
+        <w:pStyle w:val="ListParagraph"/>
+        <w:numPr>
+          <w:ilvl w:val="0"/>
+          <w:numId w:val="1"/>
+        </w:numPr>
+        <w:spacing w:after="30"/>
+      </w:pPr>
+      <w:r>
+        <w:rPr>
+          <w:sz w:val="19"/>
+          <w:szCs w:val="19"/>
+        </w:rPr>
+        <w:t xml:space="preserve">Built end-to-end test suites in Playwright and Cypress for payment processing, token generation, subscriptions and IoT device provisioning. Regression moved from a multi-day manual cycle to an automated run on every pull request.</w:t>
+      </w:r>
+    </w:p>
+    <w:p>
+      <w:pPr>
+        <w:pStyle w:val="ListParagraph"/>
+        <w:numPr>
+          <w:ilvl w:val="0"/>
+          <w:numId w:val="1"/>
+        </w:numPr>
+        <w:spacing w:after="30"/>
+      </w:pPr>
+      <w:r>
+        <w:rPr>
+          <w:sz w:val="19"/>
+          <w:szCs w:val="19"/>
+        </w:rPr>
+        <w:t xml:space="preserve">Led the Rails 5 to 7.2 upgrade across the payment, PAYG token, IoT diagnostics, subscription and firmware update systems, including multi-tenant configuration for each market.</w:t>
+      </w:r>
+    </w:p>
+    <w:p>
+      <w:pPr>
+        <w:pStyle w:val="ListParagraph"/>
+        <w:numPr>
+          <w:ilvl w:val="0"/>
+          <w:numId w:val="1"/>
+        </w:numPr>
+        <w:spacing w:after="30"/>
+      </w:pPr>
+      <w:r>
+        <w:rPr>
+          <w:sz w:val="19"/>
+          <w:szCs w:val="19"/>
+        </w:rPr>
+        <w:t xml:space="preserve">Designed asynchronous token generation on RabbitMQ and a Redshift pipeline for payment events, which removed timeouts during peak billing. Managed a team of QA engineers.</w:t>
       </w:r>
     </w:p>
     <w:p>
@@ -438,7 +438,7 @@
           <w:sz w:val="21"/>
           <w:szCs w:val="21"/>
         </w:rPr>
-        <w:t xml:space="preserve">Director of Engineering / Lead Engineer — Vishnu Systems, Inc.</w:t>
+        <w:t xml:space="preserve">Director of Engineering / Lead Engineer, Vishnu Systems, Inc.</w:t>
       </w:r>
       <w:r>
         <w:rPr>
@@ -460,58 +460,58 @@
           <w:sz w:val="19"/>
           <w:szCs w:val="19"/>
         </w:rPr>
-        <w:t xml:space="preserve">Founded and led engineering (concurrently with Baw Bab) for an ML security and robustness platform for software in and as medical devices (SiMD/SaMD).</w:t>
-      </w:r>
-    </w:p>
-    <w:p>
-      <w:pPr>
-        <w:pStyle w:val="ListParagraph"/>
-        <w:numPr>
-          <w:ilvl w:val="0"/>
-          <w:numId w:val="1"/>
-        </w:numPr>
-        <w:spacing w:after="30"/>
-      </w:pPr>
-      <w:r>
-        <w:rPr>
-          <w:sz w:val="19"/>
-          <w:szCs w:val="19"/>
-        </w:rPr>
-        <w:t xml:space="preserve">Built the platform from scratch: CNNs, RAG and GNNs to detect adversarial attacks on ML models, evaluate robustness and surface gaps against healthcare ML regulation (HIPAA, FDA 21 CFR Part 11, IEC 62304).</w:t>
-      </w:r>
-    </w:p>
-    <w:p>
-      <w:pPr>
-        <w:pStyle w:val="ListParagraph"/>
-        <w:numPr>
-          <w:ilvl w:val="0"/>
-          <w:numId w:val="1"/>
-        </w:numPr>
-        <w:spacing w:after="30"/>
-      </w:pPr>
-      <w:r>
-        <w:rPr>
-          <w:sz w:val="19"/>
-          <w:szCs w:val="19"/>
-        </w:rPr>
-        <w:t xml:space="preserve">Architected an AWS event-driven backend in Python and Rust (PyO3) with a Go middleware layer for routing, rate limiting and fan-out; circuit-breaker and back-off patterns kept a live degradation invisible to customers.</w:t>
-      </w:r>
-    </w:p>
-    <w:p>
-      <w:pPr>
-        <w:pStyle w:val="ListParagraph"/>
-        <w:numPr>
-          <w:ilvl w:val="0"/>
-          <w:numId w:val="1"/>
-        </w:numPr>
-        <w:spacing w:after="30"/>
-      </w:pPr>
-      <w:r>
-        <w:rPr>
-          <w:sz w:val="19"/>
-          <w:szCs w:val="19"/>
-        </w:rPr>
-        <w:t xml:space="preserve">Orchestrated ML pipelines with Airflow and tracked them end to end with MLflow — experiment versioning, model registry, reproducibility.</w:t>
+        <w:t xml:space="preserve">Founded the company and built its product: ML security testing for software in medical devices. Ran concurrently with Baw Bab.</w:t>
+      </w:r>
+    </w:p>
+    <w:p>
+      <w:pPr>
+        <w:pStyle w:val="ListParagraph"/>
+        <w:numPr>
+          <w:ilvl w:val="0"/>
+          <w:numId w:val="1"/>
+        </w:numPr>
+        <w:spacing w:after="30"/>
+      </w:pPr>
+      <w:r>
+        <w:rPr>
+          <w:sz w:val="19"/>
+          <w:szCs w:val="19"/>
+        </w:rPr>
+        <w:t xml:space="preserve">Built the platform from scratch. It uses CNNs, retrieval-augmented generation and graph neural networks to detect adversarial attacks on ML models and to report gaps against HIPAA, FDA 21 CFR Part 11 and IEC 62304.</w:t>
+      </w:r>
+    </w:p>
+    <w:p>
+      <w:pPr>
+        <w:pStyle w:val="ListParagraph"/>
+        <w:numPr>
+          <w:ilvl w:val="0"/>
+          <w:numId w:val="1"/>
+        </w:numPr>
+        <w:spacing w:after="30"/>
+      </w:pPr>
+      <w:r>
+        <w:rPr>
+          <w:sz w:val="19"/>
+          <w:szCs w:val="19"/>
+        </w:rPr>
+        <w:t xml:space="preserve">Designed the AWS backend in Python and Rust (PyO3) with a Go middleware layer for routing, rate limiting and fan-out to evaluation workers. Circuit breakers and back-off kept a live degradation invisible to customers.</w:t>
+      </w:r>
+    </w:p>
+    <w:p>
+      <w:pPr>
+        <w:pStyle w:val="ListParagraph"/>
+        <w:numPr>
+          <w:ilvl w:val="0"/>
+          <w:numId w:val="1"/>
+        </w:numPr>
+        <w:spacing w:after="30"/>
+      </w:pPr>
+      <w:r>
+        <w:rPr>
+          <w:sz w:val="19"/>
+          <w:szCs w:val="19"/>
+        </w:rPr>
+        <w:t xml:space="preserve">Ran ML pipelines on Airflow with MLflow for experiment tracking, model registry and reproducibility.</w:t>
       </w:r>
     </w:p>
     <w:p>
@@ -548,7 +548,7 @@
           <w:sz w:val="21"/>
           <w:szCs w:val="21"/>
         </w:rPr>
-        <w:t xml:space="preserve">Lead Software Engineer — Baw Bab Technologies, Inc.</w:t>
+        <w:t xml:space="preserve">Lead Software Engineer, Baw Bab Technologies, Inc.</w:t>
       </w:r>
       <w:r>
         <w:rPr>
@@ -570,58 +570,58 @@
           <w:sz w:val="19"/>
           <w:szCs w:val="19"/>
         </w:rPr>
-        <w:t xml:space="preserve">Led engineering (concurrently with Vishnu Systems) for a digital-addressing platform for last-mile delivery in informal urban areas across Africa.</w:t>
-      </w:r>
-    </w:p>
-    <w:p>
-      <w:pPr>
-        <w:pStyle w:val="ListParagraph"/>
-        <w:numPr>
-          <w:ilvl w:val="0"/>
-          <w:numId w:val="1"/>
-        </w:numPr>
-        <w:spacing w:after="30"/>
-      </w:pPr>
-      <w:r>
-        <w:rPr>
-          <w:sz w:val="19"/>
-          <w:szCs w:val="19"/>
-        </w:rPr>
-        <w:t xml:space="preserve">Built computer-vision pipelines over Azure, Google and OpenStreetMap satellite imagery to identify residential structures and convert them to Google Plus Codes at scale.</w:t>
-      </w:r>
-    </w:p>
-    <w:p>
-      <w:pPr>
-        <w:pStyle w:val="ListParagraph"/>
-        <w:numPr>
-          <w:ilvl w:val="0"/>
-          <w:numId w:val="1"/>
-        </w:numPr>
-        <w:spacing w:after="30"/>
-      </w:pPr>
-      <w:r>
-        <w:rPr>
-          <w:sz w:val="19"/>
-          <w:szCs w:val="19"/>
-        </w:rPr>
-        <w:t xml:space="preserve">Piloted the platform with the Nairobi County Government — the second digital-addressing programme of its kind in Africa — integrating with county land-registry records.</w:t>
-      </w:r>
-    </w:p>
-    <w:p>
-      <w:pPr>
-        <w:pStyle w:val="ListParagraph"/>
-        <w:numPr>
-          <w:ilvl w:val="0"/>
-          <w:numId w:val="1"/>
-        </w:numPr>
-        <w:spacing w:after="30"/>
-      </w:pPr>
-      <w:r>
-        <w:rPr>
-          <w:sz w:val="19"/>
-          <w:szCs w:val="19"/>
-        </w:rPr>
-        <w:t xml:space="preserve">Owned the full stack (React, Node.js, Kafka, MongoDB), the OpenAPI contracts and a Go backend-for-frontend separating field-agent mobile from county web; ran it on Azure, then hybrid Azure and GCP Cloud Run.</w:t>
+        <w:t xml:space="preserve">Digital addressing for last-mile delivery in informal urban areas. Ran concurrently with Vishnu Systems.</w:t>
+      </w:r>
+    </w:p>
+    <w:p>
+      <w:pPr>
+        <w:pStyle w:val="ListParagraph"/>
+        <w:numPr>
+          <w:ilvl w:val="0"/>
+          <w:numId w:val="1"/>
+        </w:numPr>
+        <w:spacing w:after="30"/>
+      </w:pPr>
+      <w:r>
+        <w:rPr>
+          <w:sz w:val="19"/>
+          <w:szCs w:val="19"/>
+        </w:rPr>
+        <w:t xml:space="preserve">Built computer vision pipelines over Azure, Google and OpenStreetMap satellite imagery to detect residential structures and assign them Google Plus Codes.</w:t>
+      </w:r>
+    </w:p>
+    <w:p>
+      <w:pPr>
+        <w:pStyle w:val="ListParagraph"/>
+        <w:numPr>
+          <w:ilvl w:val="0"/>
+          <w:numId w:val="1"/>
+        </w:numPr>
+        <w:spacing w:after="30"/>
+      </w:pPr>
+      <w:r>
+        <w:rPr>
+          <w:sz w:val="19"/>
+          <w:szCs w:val="19"/>
+        </w:rPr>
+        <w:t xml:space="preserve">Ran a pilot with the Nairobi County Government, the second digital addressing programme in Africa, integrated with county land registry records.</w:t>
+      </w:r>
+    </w:p>
+    <w:p>
+      <w:pPr>
+        <w:pStyle w:val="ListParagraph"/>
+        <w:numPr>
+          <w:ilvl w:val="0"/>
+          <w:numId w:val="1"/>
+        </w:numPr>
+        <w:spacing w:after="30"/>
+      </w:pPr>
+      <w:r>
+        <w:rPr>
+          <w:sz w:val="19"/>
+          <w:szCs w:val="19"/>
+        </w:rPr>
+        <w:t xml:space="preserve">Owned the stack: React, Node.js, Kafka and MongoDB, with OpenAPI contracts and a Go backend-for-frontend separating the field agent mobile app from the county web console. Hosted on Azure, later Azure and GCP Cloud Run.</w:t>
       </w:r>
     </w:p>
     <w:p>
@@ -658,7 +658,7 @@
           <w:sz w:val="21"/>
           <w:szCs w:val="21"/>
         </w:rPr>
-        <w:t xml:space="preserve">Senior Software Engineer — Reinsurance Group of America (RGA)</w:t>
+        <w:t xml:space="preserve">Senior Software Engineer, Reinsurance Group of America (RGA)</w:t>
       </w:r>
       <w:r>
         <w:rPr>
@@ -683,7 +683,7 @@
           <w:sz w:val="19"/>
           <w:szCs w:val="19"/>
         </w:rPr>
-        <w:t xml:space="preserve">Refined service boundaries and data contracts with platform architects in a correctness-critical domain; defensive coding, integration testing, careful PostgreSQL migrations, OpenAPI and contract-test conventions for independent deploys.</w:t>
+        <w:t xml:space="preserve">Worked on the Java microservices platform for actuarial, billing and reinsurance treaty processing. Defined service boundaries and data contracts with the architecture team, wrote integration tests and PostgreSQL migrations, and introduced OpenAPI and contract tests so services could deploy independently.</w:t>
       </w:r>
     </w:p>
     <w:p>
@@ -720,7 +720,7 @@
           <w:sz w:val="21"/>
           <w:szCs w:val="21"/>
         </w:rPr>
-        <w:t xml:space="preserve">Independent Engineer &amp; Mentor — Deveric Technologies</w:t>
+        <w:t xml:space="preserve">Independent Engineer &amp; Mentor, Deveric Technologies</w:t>
       </w:r>
       <w:r>
         <w:rPr>
@@ -745,7 +745,7 @@
           <w:sz w:val="19"/>
           <w:szCs w:val="19"/>
         </w:rPr>
-        <w:t xml:space="preserve">Founded the Deveric mentoring initiative — structured mentorship for 15+ developers, 6+ advancing to mid or senior roles; earned 80+ technical certifications across cloud, backend, blockchain, AI/ML and security; shipped Go, Rust and Python projects in hackathons and open source.</w:t>
+        <w:t xml:space="preserve">Founded a mentoring programme: 15 developers mentored through code review, system design sessions and career coaching, 6 of whom moved to mid or senior roles. Completed 80 technical certifications in cloud, backend, blockchain, AI and security. Built Go, Rust and Python projects for hackathons and open source.</w:t>
       </w:r>
     </w:p>
     <w:p>
@@ -782,7 +782,7 @@
           <w:sz w:val="21"/>
           <w:szCs w:val="21"/>
         </w:rPr>
-        <w:t xml:space="preserve">Software Engineer — Vecima Networks Inc. (now Concurrent)</w:t>
+        <w:t xml:space="preserve">Software Engineer, Vecima Networks Inc. (now Concurrent)</w:t>
       </w:r>
       <w:r>
         <w:rPr>
@@ -807,7 +807,7 @@
           <w:sz w:val="19"/>
           <w:szCs w:val="19"/>
         </w:rPr>
-        <w:t xml:space="preserve">Wrote low-level C and embedded assembly for streaming pipelines with deterministic store-and-replay and zero frame loss; designed fault-tolerant delivery with redundant paths, graceful degradation and self-healing recovery.</w:t>
+        <w:t xml:space="preserve">Wrote C and embedded assembly for petabyte-scale video streaming pipelines with deterministic store-and-replay and zero frame loss. Designed redundant data paths and self-healing recovery for content delivery.</w:t>
       </w:r>
     </w:p>
     <w:p>
@@ -844,7 +844,7 @@
           <w:sz w:val="21"/>
           <w:szCs w:val="21"/>
         </w:rPr>
-        <w:t xml:space="preserve">Software Engineer — Veracode</w:t>
+        <w:t xml:space="preserve">Software Engineer, Veracode</w:t>
       </w:r>
       <w:r>
         <w:rPr>
@@ -866,41 +866,41 @@
           <w:sz w:val="19"/>
           <w:szCs w:val="19"/>
         </w:rPr>
-        <w:t xml:space="preserve">Application-security platform — integrating SAST/DAST/SCA into enterprise CI/CD and DevSecOps toolchains.</w:t>
-      </w:r>
-    </w:p>
-    <w:p>
-      <w:pPr>
-        <w:pStyle w:val="ListParagraph"/>
-        <w:numPr>
-          <w:ilvl w:val="0"/>
-          <w:numId w:val="1"/>
-        </w:numPr>
-        <w:spacing w:after="30"/>
-      </w:pPr>
-      <w:r>
-        <w:rPr>
-          <w:sz w:val="19"/>
-          <w:szCs w:val="19"/>
-        </w:rPr>
-        <w:t xml:space="preserve">Built integrations embedding security scanning into customers' CI/CD (Jenkins, GitLab CI, Azure DevOps); contributed to the monolith-to-microservices decomposition on Spring Boot, JPA and Hibernate with HATEOAS REST APIs.</w:t>
-      </w:r>
-    </w:p>
-    <w:p>
-      <w:pPr>
-        <w:pStyle w:val="ListParagraph"/>
-        <w:numPr>
-          <w:ilvl w:val="0"/>
-          <w:numId w:val="1"/>
-        </w:numPr>
-        <w:spacing w:after="30"/>
-      </w:pPr>
-      <w:r>
-        <w:rPr>
-          <w:sz w:val="19"/>
-          <w:szCs w:val="19"/>
-        </w:rPr>
-        <w:t xml:space="preserve">Owned the Visual Studio plugin (.NET / Windows) end to end, including the TLS 1.2 enforcement upgrade for regulated customers; every feature reviewed against the OWASP Top 10, aligned to NIST SSDF.</w:t>
+        <w:t xml:space="preserve">Application security platform. Integrated static, dynamic and composition scanning into customer CI/CD pipelines.</w:t>
+      </w:r>
+    </w:p>
+    <w:p>
+      <w:pPr>
+        <w:pStyle w:val="ListParagraph"/>
+        <w:numPr>
+          <w:ilvl w:val="0"/>
+          <w:numId w:val="1"/>
+        </w:numPr>
+        <w:spacing w:after="30"/>
+      </w:pPr>
+      <w:r>
+        <w:rPr>
+          <w:sz w:val="19"/>
+          <w:szCs w:val="19"/>
+        </w:rPr>
+        <w:t xml:space="preserve">Built the Jenkins, GitLab CI and Azure DevOps integrations that let customers run security scans inside their build pipelines. Worked on the monolith-to-microservices decomposition on Spring Boot, JPA and Hibernate with HATEOAS REST APIs.</w:t>
+      </w:r>
+    </w:p>
+    <w:p>
+      <w:pPr>
+        <w:pStyle w:val="ListParagraph"/>
+        <w:numPr>
+          <w:ilvl w:val="0"/>
+          <w:numId w:val="1"/>
+        </w:numPr>
+        <w:spacing w:after="30"/>
+      </w:pPr>
+      <w:r>
+        <w:rPr>
+          <w:sz w:val="19"/>
+          <w:szCs w:val="19"/>
+        </w:rPr>
+        <w:t xml:space="preserve">Owned the Visual Studio plugin (.NET on Windows), including the TLS 1.2 enforcement upgrade for customers in regulated industries. Reviewed every feature against the OWASP Top 10 and NIST SSDF.</w:t>
       </w:r>
     </w:p>
     <w:p>
@@ -955,7 +955,7 @@
           <w:sz w:val="21"/>
           <w:szCs w:val="21"/>
         </w:rPr>
-        <w:t xml:space="preserve">PesaCore — .NET 10 Cloud-Native Banking Platform</w:t>
+        <w:t xml:space="preserve">PesaCore, a .NET 10 core banking platform</w:t>
       </w:r>
       <w:r>
         <w:rPr>
@@ -964,7 +964,7 @@
         </w:rPr>
         <w:t xml:space="preserve"> · </w:t>
       </w:r>
-      <w:hyperlink w:history="1" r:id="rIdl3_ot7y1re5yjb7cnglv2">
+      <w:hyperlink w:history="1" r:id="rIdlcwnq0gmhpsr0xgcbxjyg">
         <w:r>
           <w:rPr>
             <w:color w:val="1A4EA3"/>
@@ -985,7 +985,7 @@
           <w:sz w:val="19"/>
           <w:szCs w:val="19"/>
         </w:rPr>
-        <w:t xml:space="preserve">Core-banking platform on ASP.NET Core 10 with a Blazor BFF: CQRS with idempotent transfers, Postgres + Redis, OpenTelemetry to Prometheus/Grafana/Jaeger, hardened nginx edge — deployed serverless on GCP Cloud Run, 67 tests gating CI.</w:t>
+        <w:t xml:space="preserve">Core banking platform on ASP.NET Core 10 with a Blazor front end. CQRS with idempotent transfers, PostgreSQL and Redis, OpenTelemetry into Prometheus, Grafana and Jaeger, a hardened nginx edge. Runs on GCP Cloud Run with 67 tests in CI.</w:t>
       </w:r>
     </w:p>
     <w:p>
@@ -1021,7 +1021,7 @@
         </w:rPr>
         <w:t xml:space="preserve"> · </w:t>
       </w:r>
-      <w:hyperlink w:history="1" r:id="rIdnbxrff0g7yt7ksksq1-bt">
+      <w:hyperlink w:history="1" r:id="rId-a3zhkodzqq-bvksmks4w">
         <w:r>
           <w:rPr>
             <w:color w:val="1A4EA3"/>
@@ -1042,7 +1042,7 @@
           <w:sz w:val="19"/>
           <w:szCs w:val="19"/>
         </w:rPr>
-        <w:t xml:space="preserve">Event-driven micro-lending reference platform — Java 21/Spring Boot and Clojure services over Kafka with CQRS, event sourcing and a transactional outbox; React/TypeScript front end.</w:t>
+        <w:t xml:space="preserve">Micro-lending reference platform. Java 21 Spring Boot and Clojure services on Kafka with CQRS, event sourcing and a transactional outbox. React front end.</w:t>
       </w:r>
     </w:p>
     <w:p>
@@ -1069,7 +1069,7 @@
           <w:sz w:val="21"/>
           <w:szCs w:val="21"/>
         </w:rPr>
-        <w:t xml:space="preserve">UniCorns - Multi-Tenant SaaS Super-App</w:t>
+        <w:t xml:space="preserve">UniCorns, multi-tenant SaaS</w:t>
       </w:r>
       <w:r>
         <w:rPr>
@@ -1078,7 +1078,7 @@
         </w:rPr>
         <w:t xml:space="preserve"> · </w:t>
       </w:r>
-      <w:hyperlink w:history="1" r:id="rIdtk2if7hz5yak5i0ovwiyg">
+      <w:hyperlink w:history="1" r:id="rIduzhmcmuk8vwsostz_ubf-">
         <w:r>
           <w:rPr>
             <w:color w:val="1A4EA3"/>
@@ -1099,7 +1099,7 @@
           <w:sz w:val="19"/>
           <w:szCs w:val="19"/>
         </w:rPr>
-        <w:t xml:space="preserve">Multi-tenant SaaS for African clinics, pharmacies and retail: eight Rust services on AWS Lambda, DynamoDB tenant isolation via Cognito claims, offline-first web/Android/iOS clients, four payment rails (M-Pesa, Airtel, Stripe, SHA FHIR claims) — ~2,450 automated tests.</w:t>
+        <w:t xml:space="preserve">Multi-tenant SaaS for clinics, pharmacies and retail in Kenya. Eight Rust services on AWS Lambda, DynamoDB tenant isolation keyed on Cognito claims, offline-first web, Android and iOS clients, and four payment rails: M-Pesa, Airtel Money, Stripe and SHA insurance claims over FHIR. 2,450 automated tests.</w:t>
       </w:r>
     </w:p>
     <w:p>
@@ -1126,19 +1126,19 @@
           <w:sz w:val="21"/>
           <w:szCs w:val="21"/>
         </w:rPr>
-        <w:t xml:space="preserve">Vunachain — AgriTech Contract Farming &amp; Traceability</w:t>
-      </w:r>
-    </w:p>
-    <w:p>
-      <w:pPr>
-        <w:spacing w:after="60"/>
-      </w:pPr>
-      <w:r>
-        <w:rPr>
-          <w:sz w:val="19"/>
-          <w:szCs w:val="19"/>
-        </w:rPr>
-        <w:t xml:space="preserve">Agricultural supply-chain compliance and traceability (EU deforestation regulation, Kenya Tea Act): Django/PostGIS geospatial checks, event-driven harvest pipeline anchoring provenance on Celo, Merkle-batched contract allocation, M-Pesa payouts. Demo-stage.</w:t>
+        <w:t xml:space="preserve">Vunachain, agricultural traceability</w:t>
+      </w:r>
+    </w:p>
+    <w:p>
+      <w:pPr>
+        <w:spacing w:after="60"/>
+      </w:pPr>
+      <w:r>
+        <w:rPr>
+          <w:sz w:val="19"/>
+          <w:szCs w:val="19"/>
+        </w:rPr>
+        <w:t xml:space="preserve">Supply chain compliance and traceability for tea and coffee exports (EU deforestation regulation, Kenya Tea Act). Django and PostGIS for geospatial checks, an event pipeline that anchors harvest records on Celo, Merkle-batched allocation of export contracts to farmers, M-Pesa payouts. Demo stage.</w:t>
       </w:r>
     </w:p>
     <w:p>
@@ -1165,7 +1165,7 @@
           <w:sz w:val="21"/>
           <w:szCs w:val="21"/>
         </w:rPr>
-        <w:t xml:space="preserve">SwarmBench Multi-Agent LLM Empirical Study</w:t>
+        <w:t xml:space="preserve">SwarmBench, multi-agent LLM study</w:t>
       </w:r>
       <w:r>
         <w:rPr>
@@ -1174,7 +1174,7 @@
         </w:rPr>
         <w:t xml:space="preserve"> · </w:t>
       </w:r>
-      <w:hyperlink w:history="1" r:id="rIdzy1-ycky6xyuteof2ou42">
+      <w:hyperlink w:history="1" r:id="rIdkfby93jy3jy7d92rosc1e">
         <w:r>
           <w:rPr>
             <w:color w:val="1A4EA3"/>
@@ -1195,7 +1195,7 @@
           <w:sz w:val="19"/>
           <w:szCs w:val="19"/>
         </w:rPr>
-        <w:t xml:space="preserve">Empirical single-agent vs multi-agent LLM study authored as a Harbor benchmark: six iterations, two verifier types, codebases to 303K LOC — the negative result (no multi-agent wedge for tool-using agents) reported transparently.</w:t>
+        <w:t xml:space="preserve">Empirical study of single-agent versus multi-agent LLM performance on software tasks, written as a Harbor benchmark. Six iterations, two verifier types, codebases up to 303K lines. Result: no multi-agent advantage for tool-using agents, reported as found.</w:t>
       </w:r>
     </w:p>
     <w:p>
@@ -1222,7 +1222,7 @@
           <w:sz w:val="21"/>
           <w:szCs w:val="21"/>
         </w:rPr>
-        <w:t xml:space="preserve">AgentPlane — AI-Powered JIRA Board</w:t>
+        <w:t xml:space="preserve">AgentPlane, AI project planning</w:t>
       </w:r>
       <w:r>
         <w:rPr>
@@ -1231,7 +1231,7 @@
         </w:rPr>
         <w:t xml:space="preserve"> · </w:t>
       </w:r>
-      <w:hyperlink w:history="1" r:id="rIdzeunfvpq2b_s6meqlawc2">
+      <w:hyperlink w:history="1" r:id="rIdknwpt37sl71l9iovdnhyy">
         <w:r>
           <w:rPr>
             <w:color w:val="1A4EA3"/>
@@ -1252,7 +1252,7 @@
           <w:sz w:val="19"/>
           <w:szCs w:val="19"/>
         </w:rPr>
-        <w:t xml:space="preserve">AI-augmented project management: a three-agent LangGraph pipeline decomposes an epic into estimated sub-tasks with a replayable decomposition audit log; FastAPI + Next.js, cost-bounded LLM calls.</w:t>
+        <w:t xml:space="preserve">Project management tool where a three-agent LangGraph pipeline breaks an epic into estimated sub-tasks with a replayable audit log. FastAPI and Next.js with cost-bounded LLM calls.</w:t>
       </w:r>
     </w:p>
     <w:p>
@@ -1476,7 +1476,7 @@
           <w:sz w:val="20"/>
           <w:szCs w:val="20"/>
         </w:rPr>
-        <w:t xml:space="preserve"> — University of Massachusetts at Lowell</w:t>
+        <w:t xml:space="preserve">, University of Massachusetts at Lowell</w:t>
       </w:r>
       <w:r>
         <w:rPr>
@@ -1501,7 +1501,7 @@
           <w:sz w:val="19"/>
           <w:szCs w:val="19"/>
         </w:rPr>
-        <w:t xml:space="preserve">Microsoft Scholar and Google Scholar · Dean's List (nine semesters) · Omicron Delta Kappa</w:t>
+        <w:t xml:space="preserve">Microsoft Scholar and Google Scholar. Dean's List for nine semesters. Omicron Delta Kappa.</w:t>
       </w:r>
     </w:p>
     <w:p>
@@ -1538,14 +1538,14 @@
           <w:sz w:val="19"/>
           <w:szCs w:val="19"/>
         </w:rPr>
-        <w:t xml:space="preserve">Open Source &amp; Certifications: </w:t>
-      </w:r>
-      <w:r>
-        <w:rPr>
-          <w:sz w:val="19"/>
-          <w:szCs w:val="19"/>
-        </w:rPr>
-        <w:t xml:space="preserve">Public GitHub repositories across Rust, Go, TypeScript, Python, Java and C#/.NET (payments and lending platforms, distributed systems, ML pipelines); 80+ validated certifications across AWS, Azure, GCP, AI/ML, blockchain and application security.</w:t>
+        <w:t xml:space="preserve">Open source and certifications: </w:t>
+      </w:r>
+      <w:r>
+        <w:rPr>
+          <w:sz w:val="19"/>
+          <w:szCs w:val="19"/>
+        </w:rPr>
+        <w:t xml:space="preserve">Public GitHub repositories in Rust, Go, TypeScript, Python, Java and C#: payment and lending platforms, distributed systems, ML pipelines, developer tools. 80 certifications in AWS, Azure, GCP, AI, blockchain and application security.</w:t>
       </w:r>
     </w:p>
     <w:p>
@@ -1564,14 +1564,14 @@
           <w:sz w:val="19"/>
           <w:szCs w:val="19"/>
         </w:rPr>
-        <w:t xml:space="preserve">Mentorship &amp; Teaching: </w:t>
-      </w:r>
-      <w:r>
-        <w:rPr>
-          <w:sz w:val="19"/>
-          <w:szCs w:val="19"/>
-        </w:rPr>
-        <w:t xml:space="preserve">Founded the Deveric mentorship initiative (2019–present): 15+ engineers mentored, 6+ advanced to senior or lead roles. CodePath.org volunteer instructor (2024), advanced algorithms cohort.</w:t>
+        <w:t xml:space="preserve">Mentorship and teaching: </w:t>
+      </w:r>
+      <w:r>
+        <w:rPr>
+          <w:sz w:val="19"/>
+          <w:szCs w:val="19"/>
+        </w:rPr>
+        <w:t xml:space="preserve">Founded a mentoring programme in 2019: 15 engineers mentored, 6 promoted to senior or lead roles. Volunteer instructor for a CodePath.org advanced algorithms cohort in 2024.</w:t>
       </w:r>
     </w:p>
     <w:sectPr>

</xml_diff>

<commit_message>
Resume: RGA role corrected to Senior Full Stack Developer (contract) per offer letter; full-stack work restored
</commit_message>
<xml_diff>
--- a/public/Eric_Gitangu_Resume.docx
+++ b/public/Eric_Gitangu_Resume.docx
@@ -41,7 +41,7 @@
         </w:rPr>
         <w:t xml:space="preserve">Nairobi, Kenya · </w:t>
       </w:r>
-      <w:hyperlink w:history="1" r:id="rIde8jx3ytzs9kso2cs40zv7">
+      <w:hyperlink w:history="1" r:id="rIdquo1ntrjrgqeniejw1ecc">
         <w:r>
           <w:rPr>
             <w:color w:val="1A4EA3"/>
@@ -60,7 +60,7 @@
         </w:rPr>
         <w:t xml:space="preserve"> · +254 708 078 997 · </w:t>
       </w:r>
-      <w:hyperlink w:history="1" r:id="rIdvqscbe3pkoz5fnm260zeu">
+      <w:hyperlink w:history="1" r:id="rIdit8iqyetsr3znygzxp1dj">
         <w:r>
           <w:rPr>
             <w:color w:val="1A4EA3"/>
@@ -79,7 +79,7 @@
         </w:rPr>
         <w:t xml:space="preserve"> · </w:t>
       </w:r>
-      <w:hyperlink w:history="1" r:id="rIdqpqo8t7avzvq93zrgi85r">
+      <w:hyperlink w:history="1" r:id="rIdthabck3fmytom8gwtzmcs">
         <w:r>
           <w:rPr>
             <w:color w:val="1A4EA3"/>
@@ -658,7 +658,7 @@
           <w:sz w:val="21"/>
           <w:szCs w:val="21"/>
         </w:rPr>
-        <w:t xml:space="preserve">Senior Software Engineer, Reinsurance Group of America (RGA)</w:t>
+        <w:t xml:space="preserve">Senior Full Stack Developer (contract), Reinsurance Group of America (RGA)</w:t>
       </w:r>
       <w:r>
         <w:rPr>
@@ -671,19 +671,50 @@
     </w:p>
     <w:p>
       <w:pPr>
-        <w:pStyle w:val="ListParagraph"/>
-        <w:numPr>
-          <w:ilvl w:val="0"/>
-          <w:numId w:val="1"/>
-        </w:numPr>
-        <w:spacing w:after="30"/>
-      </w:pPr>
-      <w:r>
-        <w:rPr>
-          <w:sz w:val="19"/>
-          <w:szCs w:val="19"/>
-        </w:rPr>
-        <w:t xml:space="preserve">Worked on the Java microservices platform for actuarial, billing and reinsurance treaty processing. Defined service boundaries and data contracts with the architecture team, wrote integration tests and PostgreSQL migrations, and introduced OpenAPI and contract tests so services could deploy independently.</w:t>
+        <w:spacing w:after="60"/>
+      </w:pPr>
+      <w:r>
+        <w:rPr>
+          <w:i/>
+          <w:iCs/>
+          <w:sz w:val="19"/>
+          <w:szCs w:val="19"/>
+        </w:rPr>
+        <w:t xml:space="preserve">Full stack development on the Java and React platform for actuarial, billing and reinsurance treaty processing. Contract placement through Signature Commercial Solutions.</w:t>
+      </w:r>
+    </w:p>
+    <w:p>
+      <w:pPr>
+        <w:pStyle w:val="ListParagraph"/>
+        <w:numPr>
+          <w:ilvl w:val="0"/>
+          <w:numId w:val="1"/>
+        </w:numPr>
+        <w:spacing w:after="30"/>
+      </w:pPr>
+      <w:r>
+        <w:rPr>
+          <w:sz w:val="19"/>
+          <w:szCs w:val="19"/>
+        </w:rPr>
+        <w:t xml:space="preserve">Built the React front end for the treaty management dashboard, replacing a legacy JSP and Struts interface, with a Node.js API layer in front of the Spring Boot services.</w:t>
+      </w:r>
+    </w:p>
+    <w:p>
+      <w:pPr>
+        <w:pStyle w:val="ListParagraph"/>
+        <w:numPr>
+          <w:ilvl w:val="0"/>
+          <w:numId w:val="1"/>
+        </w:numPr>
+        <w:spacing w:after="30"/>
+      </w:pPr>
+      <w:r>
+        <w:rPr>
+          <w:sz w:val="19"/>
+          <w:szCs w:val="19"/>
+        </w:rPr>
+        <w:t xml:space="preserve">Defined service boundaries and data contracts with the architecture team, wrote integration tests and PostgreSQL migrations, and introduced OpenAPI and contract tests so services could deploy independently.</w:t>
       </w:r>
     </w:p>
     <w:p>
@@ -706,7 +737,7 @@
           <w:sz w:val="17"/>
           <w:szCs w:val="17"/>
         </w:rPr>
-        <w:t xml:space="preserve">Java · Spring Boot · PostgreSQL · OpenAPI · Pact</w:t>
+        <w:t xml:space="preserve">Java · Spring Boot · React · TypeScript · Node.js · PostgreSQL · OpenAPI · Pact</w:t>
       </w:r>
     </w:p>
     <w:p>
@@ -964,7 +995,7 @@
         </w:rPr>
         <w:t xml:space="preserve"> · </w:t>
       </w:r>
-      <w:hyperlink w:history="1" r:id="rIdlcwnq0gmhpsr0xgcbxjyg">
+      <w:hyperlink w:history="1" r:id="rIduumw6tpumu8cmmw4mzht0">
         <w:r>
           <w:rPr>
             <w:color w:val="1A4EA3"/>
@@ -1021,7 +1052,7 @@
         </w:rPr>
         <w:t xml:space="preserve"> · </w:t>
       </w:r>
-      <w:hyperlink w:history="1" r:id="rId-a3zhkodzqq-bvksmks4w">
+      <w:hyperlink w:history="1" r:id="rIdb2wb0kfn6wjw6qjndoxw_">
         <w:r>
           <w:rPr>
             <w:color w:val="1A4EA3"/>
@@ -1078,7 +1109,7 @@
         </w:rPr>
         <w:t xml:space="preserve"> · </w:t>
       </w:r>
-      <w:hyperlink w:history="1" r:id="rIduzhmcmuk8vwsostz_ubf-">
+      <w:hyperlink w:history="1" r:id="rIdhbsshh7bjd52o-tkcs8-0">
         <w:r>
           <w:rPr>
             <w:color w:val="1A4EA3"/>
@@ -1174,7 +1205,7 @@
         </w:rPr>
         <w:t xml:space="preserve"> · </w:t>
       </w:r>
-      <w:hyperlink w:history="1" r:id="rIdkfby93jy3jy7d92rosc1e">
+      <w:hyperlink w:history="1" r:id="rId3itbo2emoerktxf2owyps">
         <w:r>
           <w:rPr>
             <w:color w:val="1A4EA3"/>
@@ -1231,7 +1262,7 @@
         </w:rPr>
         <w:t xml:space="preserve"> · </w:t>
       </w:r>
-      <w:hyperlink w:history="1" r:id="rIdknwpt37sl71l9iovdnhyy">
+      <w:hyperlink w:history="1" r:id="rId7np6hah-dny0e1-dxydi-">
         <w:r>
           <w:rPr>
             <w:color w:val="1A4EA3"/>

</xml_diff>

<commit_message>
Resume: every role backfilled from LinkedIn, metric counts removed, primary and secondary emails, career break stated
</commit_message>
<xml_diff>
--- a/public/Eric_Gitangu_Resume.docx
+++ b/public/Eric_Gitangu_Resume.docx
@@ -41,7 +41,26 @@
         </w:rPr>
         <w:t xml:space="preserve">Nairobi, Kenya · </w:t>
       </w:r>
-      <w:hyperlink w:history="1" r:id="rIdquo1ntrjrgqeniejw1ecc">
+      <w:hyperlink w:history="1" r:id="rIdiasrsax_abarnawine9wl">
+        <w:r>
+          <w:rPr>
+            <w:color w:val="1A4EA3"/>
+            <w:sz w:val="18"/>
+            <w:szCs w:val="18"/>
+            <w:u w:val="single"/>
+          </w:rPr>
+          <w:t xml:space="preserve">developer.ericgitangu@gmail.com</w:t>
+        </w:r>
+      </w:hyperlink>
+      <w:r>
+        <w:rPr>
+          <w:color w:val="555555"/>
+          <w:sz w:val="18"/>
+          <w:szCs w:val="18"/>
+        </w:rPr>
+        <w:t xml:space="preserve"> · </w:t>
+      </w:r>
+      <w:hyperlink w:history="1" r:id="rIdrwhkpmcndo3lymddnyuzt">
         <w:r>
           <w:rPr>
             <w:color w:val="1A4EA3"/>
@@ -60,7 +79,7 @@
         </w:rPr>
         <w:t xml:space="preserve"> · +254 708 078 997 · </w:t>
       </w:r>
-      <w:hyperlink w:history="1" r:id="rIdit8iqyetsr3znygzxp1dj">
+      <w:hyperlink w:history="1" r:id="rIdr4zy2trlnlvvfjtyc5qms">
         <w:r>
           <w:rPr>
             <w:color w:val="1A4EA3"/>
@@ -79,7 +98,7 @@
         </w:rPr>
         <w:t xml:space="preserve"> · </w:t>
       </w:r>
-      <w:hyperlink w:history="1" r:id="rIdthabck3fmytom8gwtzmcs">
+      <w:hyperlink w:history="1" r:id="rIdplx4gyml-z4y9wugpc2c_">
         <w:r>
           <w:rPr>
             <w:color w:val="1A4EA3"/>
@@ -118,7 +137,7 @@
           <w:sz w:val="19"/>
           <w:szCs w:val="19"/>
         </w:rPr>
-        <w:t xml:space="preserve">Software engineer with 11 years in production systems, the last five in African fintech, mobility and energy access. I currently own platform architecture and data security for a mobility and payments company: five web applications and a mobile API on one backend, 6,800 unit tests, 280 architecture decision records, an atomic release process with automatic rollback, and card and mobile money integrations (Mastercard Payment Gateway Services, M-Pesa, MTN, Tigo) built within PCI DSS SAQ-A scope. Before that I ran CI/CD and test automation for a pay-as-you-go solar platform in seven countries, founded an ML security company for medical device software, and led a digital addressing pilot with a county government. I work in TypeScript, Java, PHP, Python, Rust, Go and C#. I design event-driven systems, plan for failure, and instrument what I ship. I set technical direction for the team, review code daily, and have mentored 15 engineers.</w:t>
+        <w:t xml:space="preserve">Software engineer with 11 years in production systems across fintech, healthcare, energy access, logistics and application security. I currently own architecture and security for a multi-surface payments and mobility platform, a Mastercard partner, where I removed an authentication bypass, closed money-correctness defects, mapped the platform to payments compliance requirements, and built card and mobile money rails within PCI DSS scope. Before that I led platform and quality engineering for a pay-as-you-go solar company in seven African countries, founded an ML security company for medical device software, and led the team behind a digital addressing pilot with the Nairobi County Government. I design event-driven systems, plan for failure, instrument what I ship, and lead teams through review, mentoring and clear technical direction. TypeScript, Java, PHP, Python, Rust, Go and C#.</w:t>
       </w:r>
     </w:p>
     <w:p>
@@ -150,7 +169,7 @@
           <w:sz w:val="21"/>
           <w:szCs w:val="21"/>
         </w:rPr>
-        <w:t xml:space="preserve">Senior Full Stack Engineer, Platform Architecture and Data Security, Moovn Technologies</w:t>
+        <w:t xml:space="preserve">Senior Full Stack Engineer, Architecture and Security, Moovn Technologies (a Mastercard partner)</w:t>
       </w:r>
       <w:r>
         <w:rPr>
@@ -158,7 +177,7 @@
           <w:sz w:val="18"/>
           <w:szCs w:val="18"/>
         </w:rPr>
-        <w:t xml:space="preserve">   Feb 2026 – Present · Nairobi, Kenya (Seattle HQ)</w:t>
+        <w:t xml:space="preserve">   Feb 2026 – Present · Nairobi, Kenya, remote</w:t>
       </w:r>
     </w:p>
     <w:p>
@@ -172,109 +191,126 @@
           <w:sz w:val="19"/>
           <w:szCs w:val="19"/>
         </w:rPr>
-        <w:t xml:space="preserve">Platform architecture and data security for a mobility and payments company operating in East and Southern Africa.</w:t>
-      </w:r>
-    </w:p>
-    <w:p>
-      <w:pPr>
-        <w:pStyle w:val="ListParagraph"/>
-        <w:numPr>
-          <w:ilvl w:val="0"/>
-          <w:numId w:val="1"/>
-        </w:numPr>
-        <w:spacing w:after="30"/>
-      </w:pPr>
-      <w:r>
-        <w:rPr>
-          <w:sz w:val="19"/>
-          <w:szCs w:val="19"/>
-        </w:rPr>
-        <w:t xml:space="preserve">Own the architecture of five web applications and a mobile API served from one PHP backend. The codebase carries 6,800 unit tests and 280 architecture decision records.</w:t>
-      </w:r>
-    </w:p>
-    <w:p>
-      <w:pPr>
-        <w:pStyle w:val="ListParagraph"/>
-        <w:numPr>
-          <w:ilvl w:val="0"/>
-          <w:numId w:val="1"/>
-        </w:numPr>
-        <w:spacing w:after="30"/>
-      </w:pPr>
-      <w:r>
-        <w:rPr>
-          <w:sz w:val="19"/>
-          <w:szCs w:val="19"/>
-        </w:rPr>
-        <w:t xml:space="preserve">Designed the release process. Each release is an immutable directory activated by a symlink flip. A post-flip smoke test rolls back automatically on a real error. Deploy is one command and finishes in under a minute; rollback is one command.</w:t>
-      </w:r>
-    </w:p>
-    <w:p>
-      <w:pPr>
-        <w:pStyle w:val="ListParagraph"/>
-        <w:numPr>
-          <w:ilvl w:val="0"/>
-          <w:numId w:val="1"/>
-        </w:numPr>
-        <w:spacing w:after="30"/>
-      </w:pPr>
-      <w:r>
-        <w:rPr>
-          <w:sz w:val="19"/>
-          <w:szCs w:val="19"/>
-        </w:rPr>
-        <w:t xml:space="preserve">Built the card top-up rail on Mastercard Payment Gateway Services hosted sessions, so card data never reaches our servers, keeping the platform in PCI DSS SAQ-A scope. Built M-Pesa STK and B2C, MTN and Tigo mobile money rails with per-country routing and idempotency that fails closed.</w:t>
-      </w:r>
-    </w:p>
-    <w:p>
-      <w:pPr>
-        <w:pStyle w:val="ListParagraph"/>
-        <w:numPr>
-          <w:ilvl w:val="0"/>
-          <w:numId w:val="1"/>
-        </w:numPr>
-        <w:spacing w:after="30"/>
-      </w:pPr>
-      <w:r>
-        <w:rPr>
-          <w:sz w:val="19"/>
-          <w:szCs w:val="19"/>
-        </w:rPr>
-        <w:t xml:space="preserve">Designed a trust score engine that ingests signed, idempotent events from partner products into a hash-chained ledger and recomputes scores nightly for 40,000 users. Rolled it out behind feature flags to the admin console, rider portal and mobile API.</w:t>
-      </w:r>
-    </w:p>
-    <w:p>
-      <w:pPr>
-        <w:pStyle w:val="ListParagraph"/>
-        <w:numPr>
-          <w:ilvl w:val="0"/>
-          <w:numId w:val="1"/>
-        </w:numPr>
-        <w:spacing w:after="30"/>
-      </w:pPr>
-      <w:r>
-        <w:rPr>
-          <w:sz w:val="19"/>
-          <w:szCs w:val="19"/>
-        </w:rPr>
-        <w:t xml:space="preserve">Hardened access and change control: key-only SSH with fail2ban, WebAuthn and TOTP MFA for admins, secret scanning and test gates in git hooks, pentest remediation, and encrypted nightly off-site database backups with restore drills.</w:t>
-      </w:r>
-    </w:p>
-    <w:p>
-      <w:pPr>
-        <w:pStyle w:val="ListParagraph"/>
-        <w:numPr>
-          <w:ilvl w:val="0"/>
-          <w:numId w:val="1"/>
-        </w:numPr>
-        <w:spacing w:after="30"/>
-      </w:pPr>
-      <w:r>
-        <w:rPr>
-          <w:sz w:val="19"/>
-          <w:szCs w:val="19"/>
-        </w:rPr>
-        <w:t xml:space="preserve">Added Prometheus, Grafana and Loki to a legacy application without changing application code. Traced a database failover storm to a mis-sequenced reboot and fixed the liveness checks. Wrote the team's release and deployment guides.</w:t>
+        <w:t xml:space="preserve">Own delivery, security and architecture for a multi-surface fintech mobility platform: consumer, partner and admin web apps and a mobile API over a service backend, covering money movement, identity and regulated payments compliance.</w:t>
+      </w:r>
+    </w:p>
+    <w:p>
+      <w:pPr>
+        <w:pStyle w:val="ListParagraph"/>
+        <w:numPr>
+          <w:ilvl w:val="0"/>
+          <w:numId w:val="1"/>
+        </w:numPr>
+        <w:spacing w:after="30"/>
+      </w:pPr>
+      <w:r>
+        <w:rPr>
+          <w:sz w:val="19"/>
+          <w:szCs w:val="19"/>
+        </w:rPr>
+        <w:t xml:space="preserve">Removed a critical authentication bypass and migrated stored credentials to modern hashing, verified on the live path.</w:t>
+      </w:r>
+    </w:p>
+    <w:p>
+      <w:pPr>
+        <w:pStyle w:val="ListParagraph"/>
+        <w:numPr>
+          <w:ilvl w:val="0"/>
+          <w:numId w:val="1"/>
+        </w:numPr>
+        <w:spacing w:after="30"/>
+      </w:pPr>
+      <w:r>
+        <w:rPr>
+          <w:sz w:val="19"/>
+          <w:szCs w:val="19"/>
+        </w:rPr>
+        <w:t xml:space="preserve">Closed money-correctness defects in locality routing and currency precision across the financial surfaces, and added idempotency that fails closed on every money path.</w:t>
+      </w:r>
+    </w:p>
+    <w:p>
+      <w:pPr>
+        <w:pStyle w:val="ListParagraph"/>
+        <w:numPr>
+          <w:ilvl w:val="0"/>
+          <w:numId w:val="1"/>
+        </w:numPr>
+        <w:spacing w:after="30"/>
+      </w:pPr>
+      <w:r>
+        <w:rPr>
+          <w:sz w:val="19"/>
+          <w:szCs w:val="19"/>
+        </w:rPr>
+        <w:t xml:space="preserve">Built the card top-up rail on Mastercard Payment Gateway Services hosted sessions, so card data never reaches our servers, and the M-Pesa, MTN and Tigo mobile money rails with per-country routing. Mapped controls to PCI DSS SAQ-A.</w:t>
+      </w:r>
+    </w:p>
+    <w:p>
+      <w:pPr>
+        <w:pStyle w:val="ListParagraph"/>
+        <w:numPr>
+          <w:ilvl w:val="0"/>
+          <w:numId w:val="1"/>
+        </w:numPr>
+        <w:spacing w:after="30"/>
+      </w:pPr>
+      <w:r>
+        <w:rPr>
+          <w:sz w:val="19"/>
+          <w:szCs w:val="19"/>
+        </w:rPr>
+        <w:t xml:space="preserve">Designed the release process: immutable releases, symlink activation, a post-deploy smoke that rolls back automatically, and a release guard on money-path files. Deploy and rollback are each one command.</w:t>
+      </w:r>
+    </w:p>
+    <w:p>
+      <w:pPr>
+        <w:pStyle w:val="ListParagraph"/>
+        <w:numPr>
+          <w:ilvl w:val="0"/>
+          <w:numId w:val="1"/>
+        </w:numPr>
+        <w:spacing w:after="30"/>
+      </w:pPr>
+      <w:r>
+        <w:rPr>
+          <w:sz w:val="19"/>
+          <w:szCs w:val="19"/>
+        </w:rPr>
+        <w:t xml:space="preserve">Designed a cross-product trust score engine with signed partner event ingestion, a tamper-evident ledger and a nightly recompute, rolled out behind feature flags to the admin console, rider portal and mobile API.</w:t>
+      </w:r>
+    </w:p>
+    <w:p>
+      <w:pPr>
+        <w:pStyle w:val="ListParagraph"/>
+        <w:numPr>
+          <w:ilvl w:val="0"/>
+          <w:numId w:val="1"/>
+        </w:numPr>
+        <w:spacing w:after="30"/>
+      </w:pPr>
+      <w:r>
+        <w:rPr>
+          <w:sz w:val="19"/>
+          <w:szCs w:val="19"/>
+        </w:rPr>
+        <w:t xml:space="preserve">Hardened access and the SDLC: key-only SSH, MFA for admins, audit trails, secret scanning and test gates in git hooks, pentest remediation, encrypted off-site backups with restore drills.</w:t>
+      </w:r>
+    </w:p>
+    <w:p>
+      <w:pPr>
+        <w:pStyle w:val="ListParagraph"/>
+        <w:numPr>
+          <w:ilvl w:val="0"/>
+          <w:numId w:val="1"/>
+        </w:numPr>
+        <w:spacing w:after="30"/>
+      </w:pPr>
+      <w:r>
+        <w:rPr>
+          <w:sz w:val="19"/>
+          <w:szCs w:val="19"/>
+        </w:rPr>
+        <w:t xml:space="preserve">Rebuilt three front-end surfaces in typed, tested React, documented the API surface, and author the architecture decision records that name trade-offs and failure modes.</w:t>
       </w:r>
     </w:p>
     <w:p>
@@ -311,7 +347,7 @@
           <w:sz w:val="21"/>
           <w:szCs w:val="21"/>
         </w:rPr>
-        <w:t xml:space="preserve">Team Lead, QA and Engineering, Ignite Energy Access (formerly ENGIE Energy Access)</w:t>
+        <w:t xml:space="preserve">Team Lead, Platform and Quality Engineering, ENGIE Energy Access, later Ignite Energy Access</w:t>
       </w:r>
       <w:r>
         <w:rPr>
@@ -319,7 +355,7 @@
           <w:sz w:val="18"/>
           <w:szCs w:val="18"/>
         </w:rPr>
-        <w:t xml:space="preserve">   May 2025 – Jan 2026 · Nairobi, Kenya</w:t>
+        <w:t xml:space="preserve">   May 2025 – Jan 2026 · Nairobi, Kenya, hybrid</w:t>
       </w:r>
     </w:p>
     <w:p>
@@ -333,75 +369,92 @@
           <w:sz w:val="19"/>
           <w:szCs w:val="19"/>
         </w:rPr>
-        <w:t xml:space="preserve">CI/CD and test automation for a pay-as-you-go solar platform in seven countries.</w:t>
-      </w:r>
-    </w:p>
-    <w:p>
-      <w:pPr>
-        <w:pStyle w:val="ListParagraph"/>
-        <w:numPr>
-          <w:ilvl w:val="0"/>
-          <w:numId w:val="1"/>
-        </w:numPr>
-        <w:spacing w:after="30"/>
-      </w:pPr>
-      <w:r>
-        <w:rPr>
-          <w:sz w:val="19"/>
-          <w:szCs w:val="19"/>
-        </w:rPr>
-        <w:t xml:space="preserve">Owned CI/CD pipelines and test infrastructure for Kenya, Uganda, Tanzania, Rwanda, Mozambique, Côte d'Ivoire and Zambia. Defined the testing standards and release gates engineering adopted.</w:t>
-      </w:r>
-    </w:p>
-    <w:p>
-      <w:pPr>
-        <w:pStyle w:val="ListParagraph"/>
-        <w:numPr>
-          <w:ilvl w:val="0"/>
-          <w:numId w:val="1"/>
-        </w:numPr>
-        <w:spacing w:after="30"/>
-      </w:pPr>
-      <w:r>
-        <w:rPr>
-          <w:sz w:val="19"/>
-          <w:szCs w:val="19"/>
-        </w:rPr>
-        <w:t xml:space="preserve">Built end-to-end test suites in Playwright and Cypress for payment processing, token generation, subscriptions and IoT device provisioning. Regression moved from a multi-day manual cycle to an automated run on every pull request.</w:t>
-      </w:r>
-    </w:p>
-    <w:p>
-      <w:pPr>
-        <w:pStyle w:val="ListParagraph"/>
-        <w:numPr>
-          <w:ilvl w:val="0"/>
-          <w:numId w:val="1"/>
-        </w:numPr>
-        <w:spacing w:after="30"/>
-      </w:pPr>
-      <w:r>
-        <w:rPr>
-          <w:sz w:val="19"/>
-          <w:szCs w:val="19"/>
-        </w:rPr>
-        <w:t xml:space="preserve">Led the Rails 5 to 7.2 upgrade across the payment, PAYG token, IoT diagnostics, subscription and firmware update systems, including multi-tenant configuration for each market.</w:t>
-      </w:r>
-    </w:p>
-    <w:p>
-      <w:pPr>
-        <w:pStyle w:val="ListParagraph"/>
-        <w:numPr>
-          <w:ilvl w:val="0"/>
-          <w:numId w:val="1"/>
-        </w:numPr>
-        <w:spacing w:after="30"/>
-      </w:pPr>
-      <w:r>
-        <w:rPr>
-          <w:sz w:val="19"/>
-          <w:szCs w:val="19"/>
-        </w:rPr>
-        <w:t xml:space="preserve">Designed asynchronous token generation on RabbitMQ and a Redshift pipeline for payment events, which removed timeouts during peak billing. Managed a team of QA engineers.</w:t>
+        <w:t xml:space="preserve">Pay-as-you-go solar platform serving seven African markets with millions of daily transactions.</w:t>
+      </w:r>
+    </w:p>
+    <w:p>
+      <w:pPr>
+        <w:pStyle w:val="ListParagraph"/>
+        <w:numPr>
+          <w:ilvl w:val="0"/>
+          <w:numId w:val="1"/>
+        </w:numPr>
+        <w:spacing w:after="30"/>
+      </w:pPr>
+      <w:r>
+        <w:rPr>
+          <w:sz w:val="19"/>
+          <w:szCs w:val="19"/>
+        </w:rPr>
+        <w:t xml:space="preserve">Designed the event-driven payment architecture: RabbitMQ-backed bounded contexts for payment, token and subscription that decoupled the synchronous PAYG lifecycle and removed peak-load timeouts across all seven markets.</w:t>
+      </w:r>
+    </w:p>
+    <w:p>
+      <w:pPr>
+        <w:pStyle w:val="ListParagraph"/>
+        <w:numPr>
+          <w:ilvl w:val="0"/>
+          <w:numId w:val="1"/>
+        </w:numPr>
+        <w:spacing w:after="30"/>
+      </w:pPr>
+      <w:r>
+        <w:rPr>
+          <w:sz w:val="19"/>
+          <w:szCs w:val="19"/>
+        </w:rPr>
+        <w:t xml:space="preserve">Instrumented tracing and monitoring across Ruby and Node.js services (OpenTelemetry, Prometheus, Grafana, Jaeger, ELK) with SLOs and error budgets; detection of payment anomalies fell from hours to under five minutes. Built the Redshift and Kafka telemetry and payment reporting pipeline.</w:t>
+      </w:r>
+    </w:p>
+    <w:p>
+      <w:pPr>
+        <w:pStyle w:val="ListParagraph"/>
+        <w:numPr>
+          <w:ilvl w:val="0"/>
+          <w:numId w:val="1"/>
+        </w:numPr>
+        <w:spacing w:after="30"/>
+      </w:pPr>
+      <w:r>
+        <w:rPr>
+          <w:sz w:val="19"/>
+          <w:szCs w:val="19"/>
+        </w:rPr>
+        <w:t xml:space="preserve">Led the shift-left quality programme: Playwright and Cypress suites covering 900 critical-path scenarios across payments, tokens, IoT provisioning and subscriptions. Regression fell from three days to 45 minutes; releases rose from 2 to 12 a week.</w:t>
+      </w:r>
+    </w:p>
+    <w:p>
+      <w:pPr>
+        <w:pStyle w:val="ListParagraph"/>
+        <w:numPr>
+          <w:ilvl w:val="0"/>
+          <w:numId w:val="1"/>
+        </w:numPr>
+        <w:spacing w:after="30"/>
+      </w:pPr>
+      <w:r>
+        <w:rPr>
+          <w:sz w:val="19"/>
+          <w:szCs w:val="19"/>
+        </w:rPr>
+        <w:t xml:space="preserve">Led the Rails 5 to 7.2 upgrade underpinning payment processing, PAYG token dispatch, IoT diagnostics and firmware updates, including a staged rollout and an incident rollback with no customer-facing downtime.</w:t>
+      </w:r>
+    </w:p>
+    <w:p>
+      <w:pPr>
+        <w:pStyle w:val="ListParagraph"/>
+        <w:numPr>
+          <w:ilvl w:val="0"/>
+          <w:numId w:val="1"/>
+        </w:numPr>
+        <w:spacing w:after="30"/>
+      </w:pPr>
+      <w:r>
+        <w:rPr>
+          <w:sz w:val="19"/>
+          <w:szCs w:val="19"/>
+        </w:rPr>
+        <w:t xml:space="preserve">Line-managed four engineers across Kenya, Uganda and Tanzania; two were promoted to senior during my tenure.</w:t>
       </w:r>
     </w:p>
     <w:p>
@@ -424,7 +477,7 @@
           <w:sz w:val="17"/>
           <w:szCs w:val="17"/>
         </w:rPr>
-        <w:t xml:space="preserve">Ruby on Rails · Playwright · Cypress · RabbitMQ · Redshift · PostgreSQL · GitLab CI · Docker · Kubernetes · K6</w:t>
+        <w:t xml:space="preserve">Ruby on Rails · Node.js · RabbitMQ · Kafka · Redshift · PostgreSQL · Playwright · Cypress · OpenTelemetry · Kubernetes</w:t>
       </w:r>
     </w:p>
     <w:p>
@@ -438,7 +491,7 @@
           <w:sz w:val="21"/>
           <w:szCs w:val="21"/>
         </w:rPr>
-        <w:t xml:space="preserve">Director of Engineering / Lead Engineer, Vishnu Systems, Inc.</w:t>
+        <w:t xml:space="preserve">Director of Engineering, Vishnu Systems, Inc.</w:t>
       </w:r>
       <w:r>
         <w:rPr>
@@ -446,7 +499,7 @@
           <w:sz w:val="18"/>
           <w:szCs w:val="18"/>
         </w:rPr>
-        <w:t xml:space="preserve">   Jan 2024 – Aug 2025 · Atlanta, GA · Remote</w:t>
+        <w:t xml:space="preserve">   Jan 2024 – Aug 2025 · Atlanta, GA, remote</w:t>
       </w:r>
     </w:p>
     <w:p>
@@ -460,58 +513,75 @@
           <w:sz w:val="19"/>
           <w:szCs w:val="19"/>
         </w:rPr>
-        <w:t xml:space="preserve">Founded the company and built its product: ML security testing for software in medical devices. Ran concurrently with Baw Bab.</w:t>
-      </w:r>
-    </w:p>
-    <w:p>
-      <w:pPr>
-        <w:pStyle w:val="ListParagraph"/>
-        <w:numPr>
-          <w:ilvl w:val="0"/>
-          <w:numId w:val="1"/>
-        </w:numPr>
-        <w:spacing w:after="30"/>
-      </w:pPr>
-      <w:r>
-        <w:rPr>
-          <w:sz w:val="19"/>
-          <w:szCs w:val="19"/>
-        </w:rPr>
-        <w:t xml:space="preserve">Built the platform from scratch. It uses CNNs, retrieval-augmented generation and graph neural networks to detect adversarial attacks on ML models and to report gaps against HIPAA, FDA 21 CFR Part 11 and IEC 62304.</w:t>
-      </w:r>
-    </w:p>
-    <w:p>
-      <w:pPr>
-        <w:pStyle w:val="ListParagraph"/>
-        <w:numPr>
-          <w:ilvl w:val="0"/>
-          <w:numId w:val="1"/>
-        </w:numPr>
-        <w:spacing w:after="30"/>
-      </w:pPr>
-      <w:r>
-        <w:rPr>
-          <w:sz w:val="19"/>
-          <w:szCs w:val="19"/>
-        </w:rPr>
-        <w:t xml:space="preserve">Designed the AWS backend in Python and Rust (PyO3) with a Go middleware layer for routing, rate limiting and fan-out to evaluation workers. Circuit breakers and back-off kept a live degradation invisible to customers.</w:t>
-      </w:r>
-    </w:p>
-    <w:p>
-      <w:pPr>
-        <w:pStyle w:val="ListParagraph"/>
-        <w:numPr>
-          <w:ilvl w:val="0"/>
-          <w:numId w:val="1"/>
-        </w:numPr>
-        <w:spacing w:after="30"/>
-      </w:pPr>
-      <w:r>
-        <w:rPr>
-          <w:sz w:val="19"/>
-          <w:szCs w:val="19"/>
-        </w:rPr>
-        <w:t xml:space="preserve">Ran ML pipelines on Airflow with MLflow for experiment tracking, model registry and reproducibility.</w:t>
+        <w:t xml:space="preserve">Founded and shipped an ML security and robustness platform for software in medical devices (SiMD and SaMD), where model failure has patient-safety implications. Ran concurrently with Baw Bab.</w:t>
+      </w:r>
+    </w:p>
+    <w:p>
+      <w:pPr>
+        <w:pStyle w:val="ListParagraph"/>
+        <w:numPr>
+          <w:ilvl w:val="0"/>
+          <w:numId w:val="1"/>
+        </w:numPr>
+        <w:spacing w:after="30"/>
+      </w:pPr>
+      <w:r>
+        <w:rPr>
+          <w:sz w:val="19"/>
+          <w:szCs w:val="19"/>
+        </w:rPr>
+        <w:t xml:space="preserve">Architected the backend: FastAPI orchestration, a Rust and PyO3 evaluation core, Go middleware for rate limiting and worker coordination, and GPU evaluation workers on AWS with idempotent workers and dead-letter queues.</w:t>
+      </w:r>
+    </w:p>
+    <w:p>
+      <w:pPr>
+        <w:pStyle w:val="ListParagraph"/>
+        <w:numPr>
+          <w:ilvl w:val="0"/>
+          <w:numId w:val="1"/>
+        </w:numPr>
+        <w:spacing w:after="30"/>
+      </w:pPr>
+      <w:r>
+        <w:rPr>
+          <w:sz w:val="19"/>
+          <w:szCs w:val="19"/>
+        </w:rPr>
+        <w:t xml:space="preserve">Shipped ML pipelines combining CNNs, retrieval-augmented generation and graph neural networks to detect adversarial attacks on medical ML models, orchestrated with Airflow and tracked with MLflow.</w:t>
+      </w:r>
+    </w:p>
+    <w:p>
+      <w:pPr>
+        <w:pStyle w:val="ListParagraph"/>
+        <w:numPr>
+          <w:ilvl w:val="0"/>
+          <w:numId w:val="1"/>
+        </w:numPr>
+        <w:spacing w:after="30"/>
+      </w:pPr>
+      <w:r>
+        <w:rPr>
+          <w:sz w:val="19"/>
+          <w:szCs w:val="19"/>
+        </w:rPr>
+        <w:t xml:space="preserve">Built compliance tooling that maps model evaluation results to FDA, HIPAA and IEC 62304 requirements, with LLM-generated regulatory documentation, in a category with few established vendors.</w:t>
+      </w:r>
+    </w:p>
+    <w:p>
+      <w:pPr>
+        <w:pStyle w:val="ListParagraph"/>
+        <w:numPr>
+          <w:ilvl w:val="0"/>
+          <w:numId w:val="1"/>
+        </w:numPr>
+        <w:spacing w:after="30"/>
+      </w:pPr>
+      <w:r>
+        <w:rPr>
+          <w:sz w:val="19"/>
+          <w:szCs w:val="19"/>
+        </w:rPr>
+        <w:t xml:space="preserve">Operated the production stack (SQS, SNS, Kinesis, hosted Kafka) and carried on-call for customer-facing evaluation SLAs.</w:t>
       </w:r>
     </w:p>
     <w:p>
@@ -548,7 +618,7 @@
           <w:sz w:val="21"/>
           <w:szCs w:val="21"/>
         </w:rPr>
-        <w:t xml:space="preserve">Lead Software Engineer, Baw Bab Technologies, Inc.</w:t>
+        <w:t xml:space="preserve">Project Lead Developer, Baw Bab Technologies, Inc.</w:t>
       </w:r>
       <w:r>
         <w:rPr>
@@ -556,7 +626,7 @@
           <w:sz w:val="18"/>
           <w:szCs w:val="18"/>
         </w:rPr>
-        <w:t xml:space="preserve">   Apr 2023 – Aug 2025 · Seattle, WA / Nairobi, Kenya</w:t>
+        <w:t xml:space="preserve">   Apr 2023 – Aug 2025 · Seattle, WA and Nairobi, remote</w:t>
       </w:r>
     </w:p>
     <w:p>
@@ -570,58 +640,58 @@
           <w:sz w:val="19"/>
           <w:szCs w:val="19"/>
         </w:rPr>
-        <w:t xml:space="preserve">Digital addressing for last-mile delivery in informal urban areas. Ran concurrently with Vishnu Systems.</w:t>
-      </w:r>
-    </w:p>
-    <w:p>
-      <w:pPr>
-        <w:pStyle w:val="ListParagraph"/>
-        <w:numPr>
-          <w:ilvl w:val="0"/>
-          <w:numId w:val="1"/>
-        </w:numPr>
-        <w:spacing w:after="30"/>
-      </w:pPr>
-      <w:r>
-        <w:rPr>
-          <w:sz w:val="19"/>
-          <w:szCs w:val="19"/>
-        </w:rPr>
-        <w:t xml:space="preserve">Built computer vision pipelines over Azure, Google and OpenStreetMap satellite imagery to detect residential structures and assign them Google Plus Codes.</w:t>
-      </w:r>
-    </w:p>
-    <w:p>
-      <w:pPr>
-        <w:pStyle w:val="ListParagraph"/>
-        <w:numPr>
-          <w:ilvl w:val="0"/>
-          <w:numId w:val="1"/>
-        </w:numPr>
-        <w:spacing w:after="30"/>
-      </w:pPr>
-      <w:r>
-        <w:rPr>
-          <w:sz w:val="19"/>
-          <w:szCs w:val="19"/>
-        </w:rPr>
-        <w:t xml:space="preserve">Ran a pilot with the Nairobi County Government, the second digital addressing programme in Africa, integrated with county land registry records.</w:t>
-      </w:r>
-    </w:p>
-    <w:p>
-      <w:pPr>
-        <w:pStyle w:val="ListParagraph"/>
-        <w:numPr>
-          <w:ilvl w:val="0"/>
-          <w:numId w:val="1"/>
-        </w:numPr>
-        <w:spacing w:after="30"/>
-      </w:pPr>
-      <w:r>
-        <w:rPr>
-          <w:sz w:val="19"/>
-          <w:szCs w:val="19"/>
-        </w:rPr>
-        <w:t xml:space="preserve">Owned the stack: React, Node.js, Kafka and MongoDB, with OpenAPI contracts and a Go backend-for-frontend separating the field agent mobile app from the county web console. Hosted on Azure, later Azure and GCP Cloud Run.</w:t>
+        <w:t xml:space="preserve">Digital addressing infrastructure for last-mile delivery in African urban areas without formal addresses. Ran concurrently with Vishnu Systems.</w:t>
+      </w:r>
+    </w:p>
+    <w:p>
+      <w:pPr>
+        <w:pStyle w:val="ListParagraph"/>
+        <w:numPr>
+          <w:ilvl w:val="0"/>
+          <w:numId w:val="1"/>
+        </w:numPr>
+        <w:spacing w:after="30"/>
+      </w:pPr>
+      <w:r>
+        <w:rPr>
+          <w:sz w:val="19"/>
+          <w:szCs w:val="19"/>
+        </w:rPr>
+        <w:t xml:space="preserve">Led a five-engineer team and shipped the Nairobi County Government pilot serving 2.3 million residents, the second digital addressing programme in Africa, integrated with the county land registry.</w:t>
+      </w:r>
+    </w:p>
+    <w:p>
+      <w:pPr>
+        <w:pStyle w:val="ListParagraph"/>
+        <w:numPr>
+          <w:ilvl w:val="0"/>
+          <w:numId w:val="1"/>
+        </w:numPr>
+        <w:spacing w:after="30"/>
+      </w:pPr>
+      <w:r>
+        <w:rPr>
+          <w:sz w:val="19"/>
+          <w:szCs w:val="19"/>
+        </w:rPr>
+        <w:t xml:space="preserve">Designed the computer vision and GIS pipeline over Azure, Google and OpenStreetMap satellite imagery that converts residential structures to Google Plus Codes, tuned for low-bandwidth field use.</w:t>
+      </w:r>
+    </w:p>
+    <w:p>
+      <w:pPr>
+        <w:pStyle w:val="ListParagraph"/>
+        <w:numPr>
+          <w:ilvl w:val="0"/>
+          <w:numId w:val="1"/>
+        </w:numPr>
+        <w:spacing w:after="30"/>
+      </w:pPr>
+      <w:r>
+        <w:rPr>
+          <w:sz w:val="19"/>
+          <w:szCs w:val="19"/>
+        </w:rPr>
+        <w:t xml:space="preserve">Owned the stack: Node.js APIs, a mobile-first React front end for field agents, Google Cloud Vision and GIS services on a Pub/Sub event bus, MongoDB and Kafka for spatial data, deployed on GCP Cloud Run and Azure.</w:t>
       </w:r>
     </w:p>
     <w:p>
@@ -644,7 +714,7 @@
           <w:sz w:val="17"/>
           <w:szCs w:val="17"/>
         </w:rPr>
-        <w:t xml:space="preserve">React · Node.js · Go · Kafka · MongoDB · PostGIS · Azure · GCP Cloud Run · OpenAPI</w:t>
+        <w:t xml:space="preserve">Node.js · React · Kafka · MongoDB · PostGIS · Google Cloud Vision · GCP Cloud Run · Azure</w:t>
       </w:r>
     </w:p>
     <w:p>
@@ -658,7 +728,7 @@
           <w:sz w:val="21"/>
           <w:szCs w:val="21"/>
         </w:rPr>
-        <w:t xml:space="preserve">Senior Full Stack Developer (contract), Reinsurance Group of America (RGA)</w:t>
+        <w:t xml:space="preserve">Software Engineer (open source, seasonal), TruStacks</w:t>
       </w:r>
       <w:r>
         <w:rPr>
@@ -666,7 +736,108 @@
           <w:sz w:val="18"/>
           <w:szCs w:val="18"/>
         </w:rPr>
-        <w:t xml:space="preserve">   Jan 2022 – Jul 2022 · Remote</w:t>
+        <w:t xml:space="preserve">   Jan 2023 – Aug 2025 · Remote</w:t>
+      </w:r>
+    </w:p>
+    <w:p>
+      <w:pPr>
+        <w:pStyle w:val="ListParagraph"/>
+        <w:numPr>
+          <w:ilvl w:val="0"/>
+          <w:numId w:val="1"/>
+        </w:numPr>
+        <w:spacing w:after="30"/>
+      </w:pPr>
+      <w:r>
+        <w:rPr>
+          <w:sz w:val="19"/>
+          <w:szCs w:val="19"/>
+        </w:rPr>
+        <w:t xml:space="preserve">Contributed pipelines to TruStacks, an open-source DevOps orchestration platform of declarative delivery stacks: dependency fetching, tests, builds, staging and security scanning across frameworks.</w:t>
+      </w:r>
+    </w:p>
+    <w:p>
+      <w:pPr>
+        <w:spacing w:after="80"/>
+      </w:pPr>
+      <w:r>
+        <w:rPr>
+          <w:b/>
+          <w:bCs/>
+          <w:color w:val="555555"/>
+          <w:sz w:val="17"/>
+          <w:szCs w:val="17"/>
+        </w:rPr>
+        <w:t xml:space="preserve">Stack: </w:t>
+      </w:r>
+      <w:r>
+        <w:rPr>
+          <w:color w:val="1A4EA3"/>
+          <w:sz w:val="17"/>
+          <w:szCs w:val="17"/>
+        </w:rPr>
+        <w:t xml:space="preserve">Go · GitHub Actions · Docker · Kubernetes</w:t>
+      </w:r>
+    </w:p>
+    <w:p>
+      <w:pPr>
+        <w:spacing w:before="120" w:after="30"/>
+      </w:pPr>
+      <w:r>
+        <w:rPr>
+          <w:b/>
+          <w:bCs/>
+          <w:sz w:val="21"/>
+          <w:szCs w:val="21"/>
+        </w:rPr>
+        <w:t xml:space="preserve">Career break, Health and professional development</w:t>
+      </w:r>
+      <w:r>
+        <w:rPr>
+          <w:color w:val="555555"/>
+          <w:sz w:val="18"/>
+          <w:szCs w:val="18"/>
+        </w:rPr>
+        <w:t xml:space="preserve">   Jul 2022 – Apr 2023 · Atlanta, GA</w:t>
+      </w:r>
+    </w:p>
+    <w:p>
+      <w:pPr>
+        <w:pStyle w:val="ListParagraph"/>
+        <w:numPr>
+          <w:ilvl w:val="0"/>
+          <w:numId w:val="1"/>
+        </w:numPr>
+        <w:spacing w:after="30"/>
+      </w:pPr>
+      <w:r>
+        <w:rPr>
+          <w:sz w:val="19"/>
+          <w:szCs w:val="19"/>
+        </w:rPr>
+        <w:t xml:space="preserve">Time taken for health and wellbeing and for structured professional development, including certifications in cloud, AI and security.</w:t>
+      </w:r>
+    </w:p>
+    <w:p>
+      <w:pPr>
+        <w:spacing w:before="120" w:after="30"/>
+      </w:pPr>
+      <w:r>
+        <w:rPr>
+          <w:b/>
+          <w:bCs/>
+          <w:sz w:val="21"/>
+          <w:szCs w:val="21"/>
+        </w:rPr>
+        <w:t xml:space="preserve">Senior Software Engineer, Full Stack (contract), Reinsurance Group of America</w:t>
+      </w:r>
+      <w:r>
+        <w:rPr>
+          <w:color w:val="555555"/>
+          <w:sz w:val="18"/>
+          <w:szCs w:val="18"/>
+        </w:rPr>
+        <w:t xml:space="preserve">   Jan 2022 – Jul 2022 · United States, remote</w:t>
       </w:r>
     </w:p>
     <w:p>
@@ -680,41 +851,41 @@
           <w:sz w:val="19"/>
           <w:szCs w:val="19"/>
         </w:rPr>
-        <w:t xml:space="preserve">Full stack development on the Java and React platform for actuarial, billing and reinsurance treaty processing. Contract placement through Signature Commercial Solutions.</w:t>
-      </w:r>
-    </w:p>
-    <w:p>
-      <w:pPr>
-        <w:pStyle w:val="ListParagraph"/>
-        <w:numPr>
-          <w:ilvl w:val="0"/>
-          <w:numId w:val="1"/>
-        </w:numPr>
-        <w:spacing w:after="30"/>
-      </w:pPr>
-      <w:r>
-        <w:rPr>
-          <w:sz w:val="19"/>
-          <w:szCs w:val="19"/>
-        </w:rPr>
-        <w:t xml:space="preserve">Built the React front end for the treaty management dashboard, replacing a legacy JSP and Struts interface, with a Node.js API layer in front of the Spring Boot services.</w:t>
-      </w:r>
-    </w:p>
-    <w:p>
-      <w:pPr>
-        <w:pStyle w:val="ListParagraph"/>
-        <w:numPr>
-          <w:ilvl w:val="0"/>
-          <w:numId w:val="1"/>
-        </w:numPr>
-        <w:spacing w:after="30"/>
-      </w:pPr>
-      <w:r>
-        <w:rPr>
-          <w:sz w:val="19"/>
-          <w:szCs w:val="19"/>
-        </w:rPr>
-        <w:t xml:space="preserve">Defined service boundaries and data contracts with the architecture team, wrote integration tests and PostgreSQL migrations, and introduced OpenAPI and contract tests so services could deploy independently.</w:t>
+        <w:t xml:space="preserve">Small team delivering internal applications for reinsurance operations across several countries, each localised with country-specific roles and access.</w:t>
+      </w:r>
+    </w:p>
+    <w:p>
+      <w:pPr>
+        <w:pStyle w:val="ListParagraph"/>
+        <w:numPr>
+          <w:ilvl w:val="0"/>
+          <w:numId w:val="1"/>
+        </w:numPr>
+        <w:spacing w:after="30"/>
+      </w:pPr>
+      <w:r>
+        <w:rPr>
+          <w:sz w:val="19"/>
+          <w:szCs w:val="19"/>
+        </w:rPr>
+        <w:t xml:space="preserve">Delivered features test-first with Jest, and end-to-end coverage with Cucumber, Puppeteer and Cypress, on a hybrid Scrum and Kanban cycle with after-hours support duty.</w:t>
+      </w:r>
+    </w:p>
+    <w:p>
+      <w:pPr>
+        <w:pStyle w:val="ListParagraph"/>
+        <w:numPr>
+          <w:ilvl w:val="0"/>
+          <w:numId w:val="1"/>
+        </w:numPr>
+        <w:spacing w:after="30"/>
+      </w:pPr>
+      <w:r>
+        <w:rPr>
+          <w:sz w:val="19"/>
+          <w:szCs w:val="19"/>
+        </w:rPr>
+        <w:t xml:space="preserve">Worked across the MERN and MEAN stacks (React, Angular, Node.js, MongoDB) and the legacy Grails and Groovy services with PostgreSQL.</w:t>
       </w:r>
     </w:p>
     <w:p>
@@ -737,7 +908,7 @@
           <w:sz w:val="17"/>
           <w:szCs w:val="17"/>
         </w:rPr>
-        <w:t xml:space="preserve">Java · Spring Boot · React · TypeScript · Node.js · PostgreSQL · OpenAPI · Pact</w:t>
+        <w:t xml:space="preserve">React · Angular · Node.js · MongoDB · PostgreSQL · Grails · Jest · Cypress</w:t>
       </w:r>
     </w:p>
     <w:p>
@@ -751,7 +922,7 @@
           <w:sz w:val="21"/>
           <w:szCs w:val="21"/>
         </w:rPr>
-        <w:t xml:space="preserve">Independent Engineer &amp; Mentor, Deveric Technologies</w:t>
+        <w:t xml:space="preserve">Lead Software Engineer (contract), Wagelyft</w:t>
       </w:r>
       <w:r>
         <w:rPr>
@@ -759,24 +930,55 @@
           <w:sz w:val="18"/>
           <w:szCs w:val="18"/>
         </w:rPr>
-        <w:t xml:space="preserve">   Jan 2019 – Feb 2022 · Nairobi, Kenya / Remote</w:t>
-      </w:r>
-    </w:p>
-    <w:p>
-      <w:pPr>
-        <w:pStyle w:val="ListParagraph"/>
-        <w:numPr>
-          <w:ilvl w:val="0"/>
-          <w:numId w:val="1"/>
-        </w:numPr>
-        <w:spacing w:after="30"/>
-      </w:pPr>
-      <w:r>
-        <w:rPr>
-          <w:sz w:val="19"/>
-          <w:szCs w:val="19"/>
-        </w:rPr>
-        <w:t xml:space="preserve">Founded a mentoring programme: 15 developers mentored through code review, system design sessions and career coaching, 6 of whom moved to mid or senior roles. Completed 80 technical certifications in cloud, backend, blockchain, AI and security. Built Go, Rust and Python projects for hackathons and open source.</w:t>
+        <w:t xml:space="preserve">   Jan 2019 – Feb 2022 · Nairobi, Kenya, remote</w:t>
+      </w:r>
+    </w:p>
+    <w:p>
+      <w:pPr>
+        <w:spacing w:after="60"/>
+      </w:pPr>
+      <w:r>
+        <w:rPr>
+          <w:i/>
+          <w:iCs/>
+          <w:sz w:val="19"/>
+          <w:szCs w:val="19"/>
+        </w:rPr>
+        <w:t xml:space="preserve">Fintech and e-commerce SaaS for small businesses in Kenya, delivered by a freelance team I led and mentored.</w:t>
+      </w:r>
+    </w:p>
+    <w:p>
+      <w:pPr>
+        <w:pStyle w:val="ListParagraph"/>
+        <w:numPr>
+          <w:ilvl w:val="0"/>
+          <w:numId w:val="1"/>
+        </w:numPr>
+        <w:spacing w:after="30"/>
+      </w:pPr>
+      <w:r>
+        <w:rPr>
+          <w:sz w:val="19"/>
+          <w:szCs w:val="19"/>
+        </w:rPr>
+        <w:t xml:space="preserve">Built C2B and B2B cloud products on Reactive Spring with Angular and on the MERN and MEAN stacks, on AWS with Docker and Kubernetes, with M-Pesa payments and multi-currency support.</w:t>
+      </w:r>
+    </w:p>
+    <w:p>
+      <w:pPr>
+        <w:pStyle w:val="ListParagraph"/>
+        <w:numPr>
+          <w:ilvl w:val="0"/>
+          <w:numId w:val="1"/>
+        </w:numPr>
+        <w:spacing w:after="30"/>
+      </w:pPr>
+      <w:r>
+        <w:rPr>
+          <w:sz w:val="19"/>
+          <w:szCs w:val="19"/>
+        </w:rPr>
+        <w:t xml:space="preserve">Ran the mentorship programme that grew the team: 15 developers mentored through code review, system design and career coaching, six of whom moved to mid or senior roles.</w:t>
       </w:r>
     </w:p>
     <w:p>
@@ -799,7 +1001,7 @@
           <w:sz w:val="17"/>
           <w:szCs w:val="17"/>
         </w:rPr>
-        <w:t xml:space="preserve">Go · Rust · Python · TypeScript · AWS · GCP · Azure</w:t>
+        <w:t xml:space="preserve">Java · Spring · Angular · React · Node.js · MongoDB · AWS · Kubernetes</w:t>
       </w:r>
     </w:p>
     <w:p>
@@ -813,7 +1015,7 @@
           <w:sz w:val="21"/>
           <w:szCs w:val="21"/>
         </w:rPr>
-        <w:t xml:space="preserve">Software Engineer, Vecima Networks Inc. (now Concurrent)</w:t>
+        <w:t xml:space="preserve">Software Engineer, Vecima Networks Inc.</w:t>
       </w:r>
       <w:r>
         <w:rPr>
@@ -838,7 +1040,7 @@
           <w:sz w:val="19"/>
           <w:szCs w:val="19"/>
         </w:rPr>
-        <w:t xml:space="preserve">Wrote C and embedded assembly for petabyte-scale video streaming pipelines with deterministic store-and-replay and zero frame loss. Designed redundant data paths and self-healing recovery for content delivery.</w:t>
+        <w:t xml:space="preserve">Wrote C and embedded assembly for petabyte-scale video streaming pipelines with deterministic store-and-replay and zero frame loss, and designed the redundant data paths and self-healing recovery for content delivery.</w:t>
       </w:r>
     </w:p>
     <w:p>
@@ -883,7 +1085,7 @@
           <w:sz w:val="18"/>
           <w:szCs w:val="18"/>
         </w:rPr>
-        <w:t xml:space="preserve">   Dec 2015 – Jan 2018 · Burlington, MA</w:t>
+        <w:t xml:space="preserve">   Dec 2015 – Feb 2018 · Burlington, MA</w:t>
       </w:r>
     </w:p>
     <w:p>
@@ -897,41 +1099,41 @@
           <w:sz w:val="19"/>
           <w:szCs w:val="19"/>
         </w:rPr>
-        <w:t xml:space="preserve">Application security platform. Integrated static, dynamic and composition scanning into customer CI/CD pipelines.</w:t>
-      </w:r>
-    </w:p>
-    <w:p>
-      <w:pPr>
-        <w:pStyle w:val="ListParagraph"/>
-        <w:numPr>
-          <w:ilvl w:val="0"/>
-          <w:numId w:val="1"/>
-        </w:numPr>
-        <w:spacing w:after="30"/>
-      </w:pPr>
-      <w:r>
-        <w:rPr>
-          <w:sz w:val="19"/>
-          <w:szCs w:val="19"/>
-        </w:rPr>
-        <w:t xml:space="preserve">Built the Jenkins, GitLab CI and Azure DevOps integrations that let customers run security scans inside their build pipelines. Worked on the monolith-to-microservices decomposition on Spring Boot, JPA and Hibernate with HATEOAS REST APIs.</w:t>
-      </w:r>
-    </w:p>
-    <w:p>
-      <w:pPr>
-        <w:pStyle w:val="ListParagraph"/>
-        <w:numPr>
-          <w:ilvl w:val="0"/>
-          <w:numId w:val="1"/>
-        </w:numPr>
-        <w:spacing w:after="30"/>
-      </w:pPr>
-      <w:r>
-        <w:rPr>
-          <w:sz w:val="19"/>
-          <w:szCs w:val="19"/>
-        </w:rPr>
-        <w:t xml:space="preserve">Owned the Visual Studio plugin (.NET on Windows), including the TLS 1.2 enforcement upgrade for customers in regulated industries. Reviewed every feature against the OWASP Top 10 and NIST SSDF.</w:t>
+        <w:t xml:space="preserve">Application security platform for static, dynamic and composition analysis of customer code.</w:t>
+      </w:r>
+    </w:p>
+    <w:p>
+      <w:pPr>
+        <w:pStyle w:val="ListParagraph"/>
+        <w:numPr>
+          <w:ilvl w:val="0"/>
+          <w:numId w:val="1"/>
+        </w:numPr>
+        <w:spacing w:after="30"/>
+      </w:pPr>
+      <w:r>
+        <w:rPr>
+          <w:sz w:val="19"/>
+          <w:szCs w:val="19"/>
+        </w:rPr>
+        <w:t xml:space="preserve">Built and extended the customer integrations, including the Jira and Visual Studio plugins and the Jenkins and GitLab CI integrations, so customers could run scans and receive findings inside their own pipelines.</w:t>
+      </w:r>
+    </w:p>
+    <w:p>
+      <w:pPr>
+        <w:pStyle w:val="ListParagraph"/>
+        <w:numPr>
+          <w:ilvl w:val="0"/>
+          <w:numId w:val="1"/>
+        </w:numPr>
+        <w:spacing w:after="30"/>
+      </w:pPr>
+      <w:r>
+        <w:rPr>
+          <w:sz w:val="19"/>
+          <w:szCs w:val="19"/>
+        </w:rPr>
+        <w:t xml:space="preserve">Worked on the core platform in Java (Spring MVC, Spring Boot, Hibernate), C# .NET and Python on Docker, Kubernetes and AWS, including the TLS 1.2 enforcement upgrade for regulated customers.</w:t>
       </w:r>
     </w:p>
     <w:p>
@@ -954,7 +1156,69 @@
           <w:sz w:val="17"/>
           <w:szCs w:val="17"/>
         </w:rPr>
-        <w:t xml:space="preserve">Java · Spring Boot · JPA/Hibernate · C#/.NET · REST · Jenkins · OWASP</w:t>
+        <w:t xml:space="preserve">Java · Spring Boot · Hibernate · C#/.NET · Python · Jenkins · Docker · AWS</w:t>
+      </w:r>
+    </w:p>
+    <w:p>
+      <w:pPr>
+        <w:spacing w:before="120" w:after="30"/>
+      </w:pPr>
+      <w:r>
+        <w:rPr>
+          <w:b/>
+          <w:bCs/>
+          <w:sz w:val="21"/>
+          <w:szCs w:val="21"/>
+        </w:rPr>
+        <w:t xml:space="preserve">Software Engineer, Intern, IBM</w:t>
+      </w:r>
+      <w:r>
+        <w:rPr>
+          <w:color w:val="555555"/>
+          <w:sz w:val="18"/>
+          <w:szCs w:val="18"/>
+        </w:rPr>
+        <w:t xml:space="preserve">   Sep 2013 – May 2014 · Littleton, MA</w:t>
+      </w:r>
+    </w:p>
+    <w:p>
+      <w:pPr>
+        <w:pStyle w:val="ListParagraph"/>
+        <w:numPr>
+          <w:ilvl w:val="0"/>
+          <w:numId w:val="1"/>
+        </w:numPr>
+        <w:spacing w:after="30"/>
+      </w:pPr>
+      <w:r>
+        <w:rPr>
+          <w:sz w:val="19"/>
+          <w:szCs w:val="19"/>
+        </w:rPr>
+        <w:t xml:space="preserve">Built the Selenium test automation for IBM Web Experience Factory with the principal architect and QA lead, integrated it into the Jenkins pipelines with Python and Bash, and built the reporting that separated real failures from false positives.</w:t>
+      </w:r>
+    </w:p>
+    <w:p>
+      <w:pPr>
+        <w:spacing w:after="80"/>
+      </w:pPr>
+      <w:r>
+        <w:rPr>
+          <w:b/>
+          <w:bCs/>
+          <w:color w:val="555555"/>
+          <w:sz w:val="17"/>
+          <w:szCs w:val="17"/>
+        </w:rPr>
+        <w:t xml:space="preserve">Stack: </w:t>
+      </w:r>
+      <w:r>
+        <w:rPr>
+          <w:color w:val="1A4EA3"/>
+          <w:sz w:val="17"/>
+          <w:szCs w:val="17"/>
+        </w:rPr>
+        <w:t xml:space="preserve">Java · Selenium · Jenkins · Python</w:t>
       </w:r>
     </w:p>
     <w:p>
@@ -995,7 +1259,7 @@
         </w:rPr>
         <w:t xml:space="preserve"> · </w:t>
       </w:r>
-      <w:hyperlink w:history="1" r:id="rIduumw6tpumu8cmmw4mzht0">
+      <w:hyperlink w:history="1" r:id="rIdtqqcskwybfwag4dr8wtr7">
         <w:r>
           <w:rPr>
             <w:color w:val="1A4EA3"/>
@@ -1016,7 +1280,7 @@
           <w:sz w:val="19"/>
           <w:szCs w:val="19"/>
         </w:rPr>
-        <w:t xml:space="preserve">Core banking platform on ASP.NET Core 10 with a Blazor front end. CQRS with idempotent transfers, PostgreSQL and Redis, OpenTelemetry into Prometheus, Grafana and Jaeger, a hardened nginx edge. Runs on GCP Cloud Run with 67 tests in CI.</w:t>
+        <w:t xml:space="preserve">Core banking platform on ASP.NET Core 10 with a Blazor front end: CQRS with idempotent transfers, PostgreSQL and Redis, OpenTelemetry, a hardened nginx edge, deployed on GCP Cloud Run.</w:t>
       </w:r>
     </w:p>
     <w:p>
@@ -1043,7 +1307,7 @@
           <w:sz w:val="21"/>
           <w:szCs w:val="21"/>
         </w:rPr>
-        <w:t xml:space="preserve">LendStream</w:t>
+        <w:t xml:space="preserve">UniCorns, multi-tenant SaaS</w:t>
       </w:r>
       <w:r>
         <w:rPr>
@@ -1052,64 +1316,7 @@
         </w:rPr>
         <w:t xml:space="preserve"> · </w:t>
       </w:r>
-      <w:hyperlink w:history="1" r:id="rIdb2wb0kfn6wjw6qjndoxw_">
-        <w:r>
-          <w:rPr>
-            <w:color w:val="1A4EA3"/>
-            <w:sz w:val="19"/>
-            <w:szCs w:val="19"/>
-            <w:u w:val="single"/>
-          </w:rPr>
-          <w:t xml:space="preserve">nanolend-app.vercel.app</w:t>
-        </w:r>
-      </w:hyperlink>
-    </w:p>
-    <w:p>
-      <w:pPr>
-        <w:spacing w:after="60"/>
-      </w:pPr>
-      <w:r>
-        <w:rPr>
-          <w:sz w:val="19"/>
-          <w:szCs w:val="19"/>
-        </w:rPr>
-        <w:t xml:space="preserve">Micro-lending reference platform. Java 21 Spring Boot and Clojure services on Kafka with CQRS, event sourcing and a transactional outbox. React front end.</w:t>
-      </w:r>
-    </w:p>
-    <w:p>
-      <w:pPr>
-        <w:spacing w:after="60"/>
-      </w:pPr>
-      <w:r>
-        <w:rPr>
-          <w:color w:val="1A4EA3"/>
-          <w:sz w:val="17"/>
-          <w:szCs w:val="17"/>
-        </w:rPr>
-        <w:t xml:space="preserve">Java 21 · Spring Boot · Clojure · React · TypeScript · Kafka · QStash · PostgreSQL · Redis · Docker</w:t>
-      </w:r>
-    </w:p>
-    <w:p>
-      <w:pPr>
-        <w:spacing w:before="80" w:after="20"/>
-      </w:pPr>
-      <w:r>
-        <w:rPr>
-          <w:b/>
-          <w:bCs/>
-          <w:sz w:val="21"/>
-          <w:szCs w:val="21"/>
-        </w:rPr>
-        <w:t xml:space="preserve">UniCorns, multi-tenant SaaS</w:t>
-      </w:r>
-      <w:r>
-        <w:rPr>
-          <w:sz w:val="19"/>
-          <w:szCs w:val="19"/>
-        </w:rPr>
-        <w:t xml:space="preserve"> · </w:t>
-      </w:r>
-      <w:hyperlink w:history="1" r:id="rIdhbsshh7bjd52o-tkcs8-0">
+      <w:hyperlink w:history="1" r:id="rIdl3q_axlx3qyq1fpcmwucy">
         <w:r>
           <w:rPr>
             <w:color w:val="1A4EA3"/>
@@ -1130,7 +1337,7 @@
           <w:sz w:val="19"/>
           <w:szCs w:val="19"/>
         </w:rPr>
-        <w:t xml:space="preserve">Multi-tenant SaaS for clinics, pharmacies and retail in Kenya. Eight Rust services on AWS Lambda, DynamoDB tenant isolation keyed on Cognito claims, offline-first web, Android and iOS clients, and four payment rails: M-Pesa, Airtel Money, Stripe and SHA insurance claims over FHIR. 2,450 automated tests.</w:t>
+        <w:t xml:space="preserve">Multi-tenant SaaS for clinics, pharmacies and retail in Kenya: eight Rust services on AWS Lambda, tenant isolation on Cognito claims, offline-first web and mobile clients, M-Pesa, Airtel, Stripe and SHA claims rails.</w:t>
       </w:r>
     </w:p>
     <w:p>
@@ -1169,7 +1376,7 @@
           <w:sz w:val="19"/>
           <w:szCs w:val="19"/>
         </w:rPr>
-        <w:t xml:space="preserve">Supply chain compliance and traceability for tea and coffee exports (EU deforestation regulation, Kenya Tea Act). Django and PostGIS for geospatial checks, an event pipeline that anchors harvest records on Celo, Merkle-batched allocation of export contracts to farmers, M-Pesa payouts. Demo stage.</w:t>
+        <w:t xml:space="preserve">Supply chain traceability for tea and coffee exports under EU deforestation rules: Django and PostGIS geospatial checks, harvest records anchored on Celo, M-Pesa payouts. Demo stage.</w:t>
       </w:r>
     </w:p>
     <w:p>
@@ -1183,120 +1390,6 @@
           <w:szCs w:val="17"/>
         </w:rPr>
         <w:t xml:space="preserve">Rust · AWS Lambda · ARM64/Graviton · EventBridge · SQS · DLQs · S3 · RDS PostgreSQL · CloudWatch · X-Ray</w:t>
-      </w:r>
-    </w:p>
-    <w:p>
-      <w:pPr>
-        <w:spacing w:before="80" w:after="20"/>
-      </w:pPr>
-      <w:r>
-        <w:rPr>
-          <w:b/>
-          <w:bCs/>
-          <w:sz w:val="21"/>
-          <w:szCs w:val="21"/>
-        </w:rPr>
-        <w:t xml:space="preserve">SwarmBench, multi-agent LLM study</w:t>
-      </w:r>
-      <w:r>
-        <w:rPr>
-          <w:sz w:val="19"/>
-          <w:szCs w:val="19"/>
-        </w:rPr>
-        <w:t xml:space="preserve"> · </w:t>
-      </w:r>
-      <w:hyperlink w:history="1" r:id="rId3itbo2emoerktxf2owyps">
-        <w:r>
-          <w:rPr>
-            <w:color w:val="1A4EA3"/>
-            <w:sz w:val="19"/>
-            <w:szCs w:val="19"/>
-            <w:u w:val="single"/>
-          </w:rPr>
-          <w:t xml:space="preserve">developer.ericgitangu.com/pdf/research-paper.pdf</w:t>
-        </w:r>
-      </w:hyperlink>
-    </w:p>
-    <w:p>
-      <w:pPr>
-        <w:spacing w:after="60"/>
-      </w:pPr>
-      <w:r>
-        <w:rPr>
-          <w:sz w:val="19"/>
-          <w:szCs w:val="19"/>
-        </w:rPr>
-        <w:t xml:space="preserve">Empirical study of single-agent versus multi-agent LLM performance on software tasks, written as a Harbor benchmark. Six iterations, two verifier types, codebases up to 303K lines. Result: no multi-agent advantage for tool-using agents, reported as found.</w:t>
-      </w:r>
-    </w:p>
-    <w:p>
-      <w:pPr>
-        <w:spacing w:after="60"/>
-      </w:pPr>
-      <w:r>
-        <w:rPr>
-          <w:color w:val="1A4EA3"/>
-          <w:sz w:val="17"/>
-          <w:szCs w:val="17"/>
-        </w:rPr>
-        <w:t xml:space="preserve">Kimi K2.5 · Fireworks AI · Harbor · Docker · Python · pandoc · WeasyPrint · LLM-as-judge · Multi-Agent Systems · Benchmark Design</w:t>
-      </w:r>
-    </w:p>
-    <w:p>
-      <w:pPr>
-        <w:spacing w:before="80" w:after="20"/>
-      </w:pPr>
-      <w:r>
-        <w:rPr>
-          <w:b/>
-          <w:bCs/>
-          <w:sz w:val="21"/>
-          <w:szCs w:val="21"/>
-        </w:rPr>
-        <w:t xml:space="preserve">AgentPlane, AI project planning</w:t>
-      </w:r>
-      <w:r>
-        <w:rPr>
-          <w:sz w:val="19"/>
-          <w:szCs w:val="19"/>
-        </w:rPr>
-        <w:t xml:space="preserve"> · </w:t>
-      </w:r>
-      <w:hyperlink w:history="1" r:id="rId7np6hah-dny0e1-dxydi-">
-        <w:r>
-          <w:rPr>
-            <w:color w:val="1A4EA3"/>
-            <w:sz w:val="19"/>
-            <w:szCs w:val="19"/>
-            <w:u w:val="single"/>
-          </w:rPr>
-          <w:t xml:space="preserve">agent-plane.ericgitangu.com</w:t>
-        </w:r>
-      </w:hyperlink>
-    </w:p>
-    <w:p>
-      <w:pPr>
-        <w:spacing w:after="60"/>
-      </w:pPr>
-      <w:r>
-        <w:rPr>
-          <w:sz w:val="19"/>
-          <w:szCs w:val="19"/>
-        </w:rPr>
-        <w:t xml:space="preserve">Project management tool where a three-agent LangGraph pipeline breaks an epic into estimated sub-tasks with a replayable audit log. FastAPI and Next.js with cost-bounded LLM calls.</w:t>
-      </w:r>
-    </w:p>
-    <w:p>
-      <w:pPr>
-        <w:spacing w:after="60"/>
-      </w:pPr>
-      <w:r>
-        <w:rPr>
-          <w:color w:val="1A4EA3"/>
-          <w:sz w:val="17"/>
-          <w:szCs w:val="17"/>
-        </w:rPr>
-        <w:t xml:space="preserve">Python 3.12 · FastAPI · LangGraph · LangChain · Anthropic · Next.js 14 · TypeScript · TanStack Query · CockroachDB · MongoDB Atlas</w:t>
       </w:r>
     </w:p>
     <w:p>
@@ -1445,27 +1538,6 @@
     </w:p>
     <w:p>
       <w:pPr>
-        <w:spacing w:after="60"/>
-      </w:pPr>
-      <w:r>
-        <w:rPr>
-          <w:b/>
-          <w:bCs/>
-          <w:sz w:val="19"/>
-          <w:szCs w:val="19"/>
-        </w:rPr>
-        <w:t xml:space="preserve">Frontend &amp; Mobile: </w:t>
-      </w:r>
-      <w:r>
-        <w:rPr>
-          <w:sz w:val="19"/>
-          <w:szCs w:val="19"/>
-        </w:rPr>
-        <w:t xml:space="preserve">React · Next.js · TypeScript · Angular · Vue.js · Tailwind CSS · PWA · Kotlin + Jetpack Compose · Swift/SwiftUI · Electron</w:t>
-      </w:r>
-    </w:p>
-    <w:p>
-      <w:pPr>
         <w:pBdr>
           <w:bottom w:val="single" w:color="555555" w:sz="4" w:space="1"/>
         </w:pBdr>
@@ -1479,7 +1551,7 @@
           <w:sz w:val="22"/>
           <w:szCs w:val="22"/>
         </w:rPr>
-        <w:t xml:space="preserve">EDUCATION</w:t>
+        <w:t xml:space="preserve">EDUCATION, CERTIFICATIONS AND OPEN SOURCE</w:t>
       </w:r>
     </w:p>
     <w:p>
@@ -1525,41 +1597,6 @@
           <w:ilvl w:val="0"/>
           <w:numId w:val="1"/>
         </w:numPr>
-        <w:spacing w:after="30"/>
-      </w:pPr>
-      <w:r>
-        <w:rPr>
-          <w:sz w:val="19"/>
-          <w:szCs w:val="19"/>
-        </w:rPr>
-        <w:t xml:space="preserve">Microsoft Scholar and Google Scholar. Dean's List for nine semesters. Omicron Delta Kappa.</w:t>
-      </w:r>
-    </w:p>
-    <w:p>
-      <w:pPr>
-        <w:pBdr>
-          <w:bottom w:val="single" w:color="555555" w:sz="4" w:space="1"/>
-        </w:pBdr>
-        <w:spacing w:before="220" w:after="80"/>
-      </w:pPr>
-      <w:r>
-        <w:rPr>
-          <w:b/>
-          <w:bCs/>
-          <w:spacing w:val="30"/>
-          <w:sz w:val="22"/>
-          <w:szCs w:val="22"/>
-        </w:rPr>
-        <w:t xml:space="preserve">CERTIFICATIONS &amp; OPEN SOURCE</w:t>
-      </w:r>
-    </w:p>
-    <w:p>
-      <w:pPr>
-        <w:pStyle w:val="ListParagraph"/>
-        <w:numPr>
-          <w:ilvl w:val="0"/>
-          <w:numId w:val="1"/>
-        </w:numPr>
         <w:spacing w:after="40"/>
       </w:pPr>
       <w:r>
@@ -1576,33 +1613,7 @@
           <w:sz w:val="19"/>
           <w:szCs w:val="19"/>
         </w:rPr>
-        <w:t xml:space="preserve">Public GitHub repositories in Rust, Go, TypeScript, Python, Java and C#: payment and lending platforms, distributed systems, ML pipelines, developer tools. 80 certifications in AWS, Azure, GCP, AI, blockchain and application security.</w:t>
-      </w:r>
-    </w:p>
-    <w:p>
-      <w:pPr>
-        <w:pStyle w:val="ListParagraph"/>
-        <w:numPr>
-          <w:ilvl w:val="0"/>
-          <w:numId w:val="1"/>
-        </w:numPr>
-        <w:spacing w:after="40"/>
-      </w:pPr>
-      <w:r>
-        <w:rPr>
-          <w:b/>
-          <w:bCs/>
-          <w:sz w:val="19"/>
-          <w:szCs w:val="19"/>
-        </w:rPr>
-        <w:t xml:space="preserve">Mentorship and teaching: </w:t>
-      </w:r>
-      <w:r>
-        <w:rPr>
-          <w:sz w:val="19"/>
-          <w:szCs w:val="19"/>
-        </w:rPr>
-        <w:t xml:space="preserve">Founded a mentoring programme in 2019: 15 engineers mentored, 6 promoted to senior or lead roles. Volunteer instructor for a CodePath.org advanced algorithms cohort in 2024.</w:t>
+        <w:t xml:space="preserve">Public GitHub repositories in Rust, Go, TypeScript, Python, Java and C#, plus contributions to TruStacks. 80 certifications in AWS, Azure, GCP, AI, blockchain and application security. 15 engineers mentored since 2019, six promoted to senior or lead roles.</w:t>
       </w:r>
     </w:p>
     <w:sectPr>

</xml_diff>

<commit_message>
Resume: comprehensive edition; AI projects, honours and mentorship restored; resume URL in header
</commit_message>
<xml_diff>
--- a/public/Eric_Gitangu_Resume.docx
+++ b/public/Eric_Gitangu_Resume.docx
@@ -41,7 +41,7 @@
         </w:rPr>
         <w:t xml:space="preserve">Nairobi, Kenya · </w:t>
       </w:r>
-      <w:hyperlink w:history="1" r:id="rIdiasrsax_abarnawine9wl">
+      <w:hyperlink w:history="1" r:id="rIdozab6b3a2sd2bavhpvzwt">
         <w:r>
           <w:rPr>
             <w:color w:val="1A4EA3"/>
@@ -60,7 +60,7 @@
         </w:rPr>
         <w:t xml:space="preserve"> · </w:t>
       </w:r>
-      <w:hyperlink w:history="1" r:id="rIdrwhkpmcndo3lymddnyuzt">
+      <w:hyperlink w:history="1" r:id="rIde0celchqku1cetglxql7y">
         <w:r>
           <w:rPr>
             <w:color w:val="1A4EA3"/>
@@ -79,7 +79,7 @@
         </w:rPr>
         <w:t xml:space="preserve"> · +254 708 078 997 · </w:t>
       </w:r>
-      <w:hyperlink w:history="1" r:id="rIdr4zy2trlnlvvfjtyc5qms">
+      <w:hyperlink w:history="1" r:id="rIdvnl3_tkh0rofysfolgyqz">
         <w:r>
           <w:rPr>
             <w:color w:val="1A4EA3"/>
@@ -98,7 +98,7 @@
         </w:rPr>
         <w:t xml:space="preserve"> · </w:t>
       </w:r>
-      <w:hyperlink w:history="1" r:id="rIdplx4gyml-z4y9wugpc2c_">
+      <w:hyperlink w:history="1" r:id="rIdwcbnu6mi0vinfod4hkpqi">
         <w:r>
           <w:rPr>
             <w:color w:val="1A4EA3"/>
@@ -109,6 +109,25 @@
           <w:t xml:space="preserve">github.com/ericgitangu</w:t>
         </w:r>
       </w:hyperlink>
+      <w:r>
+        <w:rPr>
+          <w:color w:val="555555"/>
+          <w:sz w:val="18"/>
+          <w:szCs w:val="18"/>
+        </w:rPr>
+        <w:t xml:space="preserve"> · </w:t>
+      </w:r>
+      <w:hyperlink w:history="1" r:id="rIdblj2ws54sv4grmxqowywr">
+        <w:r>
+          <w:rPr>
+            <w:color w:val="1A4EA3"/>
+            <w:sz w:val="18"/>
+            <w:szCs w:val="18"/>
+            <w:u w:val="single"/>
+          </w:rPr>
+          <w:t xml:space="preserve">resume.ericgitangu.com</w:t>
+        </w:r>
+      </w:hyperlink>
     </w:p>
     <w:p>
       <w:pPr>
@@ -1259,7 +1278,7 @@
         </w:rPr>
         <w:t xml:space="preserve"> · </w:t>
       </w:r>
-      <w:hyperlink w:history="1" r:id="rIdtqqcskwybfwag4dr8wtr7">
+      <w:hyperlink w:history="1" r:id="rId8mssqxhwui0qlrsljmfvg">
         <w:r>
           <w:rPr>
             <w:color w:val="1A4EA3"/>
@@ -1307,6 +1326,63 @@
           <w:sz w:val="21"/>
           <w:szCs w:val="21"/>
         </w:rPr>
+        <w:t xml:space="preserve">LendStream</w:t>
+      </w:r>
+      <w:r>
+        <w:rPr>
+          <w:sz w:val="19"/>
+          <w:szCs w:val="19"/>
+        </w:rPr>
+        <w:t xml:space="preserve"> · </w:t>
+      </w:r>
+      <w:hyperlink w:history="1" r:id="rIdrrvsb-bct5o5zhb9dapym">
+        <w:r>
+          <w:rPr>
+            <w:color w:val="1A4EA3"/>
+            <w:sz w:val="19"/>
+            <w:szCs w:val="19"/>
+            <w:u w:val="single"/>
+          </w:rPr>
+          <w:t xml:space="preserve">nanolend-app.vercel.app</w:t>
+        </w:r>
+      </w:hyperlink>
+    </w:p>
+    <w:p>
+      <w:pPr>
+        <w:spacing w:after="60"/>
+      </w:pPr>
+      <w:r>
+        <w:rPr>
+          <w:sz w:val="19"/>
+          <w:szCs w:val="19"/>
+        </w:rPr>
+        <w:t xml:space="preserve">Micro-lending reference platform: Java 21 Spring Boot and Clojure services on Kafka with CQRS, event sourcing and a transactional outbox.</w:t>
+      </w:r>
+    </w:p>
+    <w:p>
+      <w:pPr>
+        <w:spacing w:after="60"/>
+      </w:pPr>
+      <w:r>
+        <w:rPr>
+          <w:color w:val="1A4EA3"/>
+          <w:sz w:val="17"/>
+          <w:szCs w:val="17"/>
+        </w:rPr>
+        <w:t xml:space="preserve">Java 21 · Spring Boot · Clojure · React · TypeScript · Kafka · QStash · PostgreSQL · Redis · Docker</w:t>
+      </w:r>
+    </w:p>
+    <w:p>
+      <w:pPr>
+        <w:spacing w:before="80" w:after="20"/>
+      </w:pPr>
+      <w:r>
+        <w:rPr>
+          <w:b/>
+          <w:bCs/>
+          <w:sz w:val="21"/>
+          <w:szCs w:val="21"/>
+        </w:rPr>
         <w:t xml:space="preserve">UniCorns, multi-tenant SaaS</w:t>
       </w:r>
       <w:r>
@@ -1316,7 +1392,7 @@
         </w:rPr>
         <w:t xml:space="preserve"> · </w:t>
       </w:r>
-      <w:hyperlink w:history="1" r:id="rIdl3q_axlx3qyq1fpcmwucy">
+      <w:hyperlink w:history="1" r:id="rIdlpg_e8g_vcng5orgfufws">
         <w:r>
           <w:rPr>
             <w:color w:val="1A4EA3"/>
@@ -1394,6 +1470,177 @@
     </w:p>
     <w:p>
       <w:pPr>
+        <w:spacing w:before="80" w:after="20"/>
+      </w:pPr>
+      <w:r>
+        <w:rPr>
+          <w:b/>
+          <w:bCs/>
+          <w:sz w:val="21"/>
+          <w:szCs w:val="21"/>
+        </w:rPr>
+        <w:t xml:space="preserve">SwarmBench, multi-agent LLM study</w:t>
+      </w:r>
+      <w:r>
+        <w:rPr>
+          <w:sz w:val="19"/>
+          <w:szCs w:val="19"/>
+        </w:rPr>
+        <w:t xml:space="preserve"> · </w:t>
+      </w:r>
+      <w:hyperlink w:history="1" r:id="rIdudz4qgvylpvtm_-b3zxpd">
+        <w:r>
+          <w:rPr>
+            <w:color w:val="1A4EA3"/>
+            <w:sz w:val="19"/>
+            <w:szCs w:val="19"/>
+            <w:u w:val="single"/>
+          </w:rPr>
+          <w:t xml:space="preserve">developer.ericgitangu.com/pdf/research-paper.pdf</w:t>
+        </w:r>
+      </w:hyperlink>
+    </w:p>
+    <w:p>
+      <w:pPr>
+        <w:spacing w:after="60"/>
+      </w:pPr>
+      <w:r>
+        <w:rPr>
+          <w:sz w:val="19"/>
+          <w:szCs w:val="19"/>
+        </w:rPr>
+        <w:t xml:space="preserve">Empirical study of single-agent versus multi-agent LLM performance on software tasks, written as a Harbor benchmark across codebases up to 303K lines. No multi-agent advantage found for tool-using agents.</w:t>
+      </w:r>
+    </w:p>
+    <w:p>
+      <w:pPr>
+        <w:spacing w:after="60"/>
+      </w:pPr>
+      <w:r>
+        <w:rPr>
+          <w:color w:val="1A4EA3"/>
+          <w:sz w:val="17"/>
+          <w:szCs w:val="17"/>
+        </w:rPr>
+        <w:t xml:space="preserve">Kimi K2.5 · Fireworks AI · Harbor · Docker · Python · pandoc · WeasyPrint · LLM-as-judge · Multi-Agent Systems · Benchmark Design</w:t>
+      </w:r>
+    </w:p>
+    <w:p>
+      <w:pPr>
+        <w:spacing w:before="80" w:after="20"/>
+      </w:pPr>
+      <w:r>
+        <w:rPr>
+          <w:b/>
+          <w:bCs/>
+          <w:sz w:val="21"/>
+          <w:szCs w:val="21"/>
+        </w:rPr>
+        <w:t xml:space="preserve">AgentPlane, AI project planning</w:t>
+      </w:r>
+      <w:r>
+        <w:rPr>
+          <w:sz w:val="19"/>
+          <w:szCs w:val="19"/>
+        </w:rPr>
+        <w:t xml:space="preserve"> · </w:t>
+      </w:r>
+      <w:hyperlink w:history="1" r:id="rIdmqjyd0tkis4fxei6xagpf">
+        <w:r>
+          <w:rPr>
+            <w:color w:val="1A4EA3"/>
+            <w:sz w:val="19"/>
+            <w:szCs w:val="19"/>
+            <w:u w:val="single"/>
+          </w:rPr>
+          <w:t xml:space="preserve">agent-plane.ericgitangu.com</w:t>
+        </w:r>
+      </w:hyperlink>
+    </w:p>
+    <w:p>
+      <w:pPr>
+        <w:spacing w:after="60"/>
+      </w:pPr>
+      <w:r>
+        <w:rPr>
+          <w:sz w:val="19"/>
+          <w:szCs w:val="19"/>
+        </w:rPr>
+        <w:t xml:space="preserve">Project management tool where a three-agent LangGraph pipeline breaks an epic into estimated sub-tasks with a replayable audit log. FastAPI and Next.js with cost-bounded LLM calls.</w:t>
+      </w:r>
+    </w:p>
+    <w:p>
+      <w:pPr>
+        <w:spacing w:after="60"/>
+      </w:pPr>
+      <w:r>
+        <w:rPr>
+          <w:color w:val="1A4EA3"/>
+          <w:sz w:val="17"/>
+          <w:szCs w:val="17"/>
+        </w:rPr>
+        <w:t xml:space="preserve">Python 3.12 · FastAPI · LangGraph · LangChain · Anthropic · Next.js 14 · TypeScript · TanStack Query · CockroachDB · MongoDB Atlas</w:t>
+      </w:r>
+    </w:p>
+    <w:p>
+      <w:pPr>
+        <w:spacing w:before="80" w:after="20"/>
+      </w:pPr>
+      <w:r>
+        <w:rPr>
+          <w:b/>
+          <w:bCs/>
+          <w:sz w:val="21"/>
+          <w:szCs w:val="21"/>
+        </w:rPr>
+        <w:t xml:space="preserve">PawaCloud, AI cloud advisor</w:t>
+      </w:r>
+      <w:r>
+        <w:rPr>
+          <w:sz w:val="19"/>
+          <w:szCs w:val="19"/>
+        </w:rPr>
+        <w:t xml:space="preserve"> · </w:t>
+      </w:r>
+      <w:hyperlink w:history="1" r:id="rIddpqd1g6iqhybqq7wd30-z">
+        <w:r>
+          <w:rPr>
+            <w:color w:val="1A4EA3"/>
+            <w:sz w:val="19"/>
+            <w:szCs w:val="19"/>
+            <w:u w:val="single"/>
+          </w:rPr>
+          <w:t xml:space="preserve">pawacloud-web.vercel.app</w:t>
+        </w:r>
+      </w:hyperlink>
+    </w:p>
+    <w:p>
+      <w:pPr>
+        <w:spacing w:after="60"/>
+      </w:pPr>
+      <w:r>
+        <w:rPr>
+          <w:sz w:val="19"/>
+          <w:szCs w:val="19"/>
+        </w:rPr>
+        <w:t xml:space="preserve">Conversational cloud-architecture advisor on Gemini 2.5 Flash with a Rust and PyO3 text-processing core, server-sent event streaming, Google OAuth and PostgreSQL, deployed on GCP Cloud Run.</w:t>
+      </w:r>
+    </w:p>
+    <w:p>
+      <w:pPr>
+        <w:spacing w:after="60"/>
+      </w:pPr>
+      <w:r>
+        <w:rPr>
+          <w:color w:val="1A4EA3"/>
+          <w:sz w:val="17"/>
+          <w:szCs w:val="17"/>
+        </w:rPr>
+        <w:t xml:space="preserve">Python · FastAPI · Rust · PyO3 · Gemini AI · Next.js · TailwindCSS · PostgreSQL · Google Cloud · Cloud Run</w:t>
+      </w:r>
+    </w:p>
+    <w:p>
+      <w:pPr>
         <w:pBdr>
           <w:bottom w:val="single" w:color="555555" w:sz="4" w:space="1"/>
         </w:pBdr>
@@ -1538,6 +1785,27 @@
     </w:p>
     <w:p>
       <w:pPr>
+        <w:spacing w:after="60"/>
+      </w:pPr>
+      <w:r>
+        <w:rPr>
+          <w:b/>
+          <w:bCs/>
+          <w:sz w:val="19"/>
+          <w:szCs w:val="19"/>
+        </w:rPr>
+        <w:t xml:space="preserve">Frontend &amp; Mobile: </w:t>
+      </w:r>
+      <w:r>
+        <w:rPr>
+          <w:sz w:val="19"/>
+          <w:szCs w:val="19"/>
+        </w:rPr>
+        <w:t xml:space="preserve">React · Next.js · TypeScript · Angular · Vue.js · Tailwind CSS · PWA · Kotlin + Jetpack Compose · Swift/SwiftUI · Electron</w:t>
+      </w:r>
+    </w:p>
+    <w:p>
+      <w:pPr>
         <w:pBdr>
           <w:bottom w:val="single" w:color="555555" w:sz="4" w:space="1"/>
         </w:pBdr>
@@ -1597,6 +1865,23 @@
           <w:ilvl w:val="0"/>
           <w:numId w:val="1"/>
         </w:numPr>
+        <w:spacing w:after="30"/>
+      </w:pPr>
+      <w:r>
+        <w:rPr>
+          <w:sz w:val="19"/>
+          <w:szCs w:val="19"/>
+        </w:rPr>
+        <w:t xml:space="preserve">Microsoft Scholar and Google Scholar. Dean's List for nine semesters. Omicron Delta Kappa.</w:t>
+      </w:r>
+    </w:p>
+    <w:p>
+      <w:pPr>
+        <w:pStyle w:val="ListParagraph"/>
+        <w:numPr>
+          <w:ilvl w:val="0"/>
+          <w:numId w:val="1"/>
+        </w:numPr>
         <w:spacing w:after="40"/>
       </w:pPr>
       <w:r>
@@ -1613,7 +1898,33 @@
           <w:sz w:val="19"/>
           <w:szCs w:val="19"/>
         </w:rPr>
-        <w:t xml:space="preserve">Public GitHub repositories in Rust, Go, TypeScript, Python, Java and C#, plus contributions to TruStacks. 80 certifications in AWS, Azure, GCP, AI, blockchain and application security. 15 engineers mentored since 2019, six promoted to senior or lead roles.</w:t>
+        <w:t xml:space="preserve">Public GitHub repositories in Rust, Go, TypeScript, Python, Java and C#, plus contributions to TruStacks. 80 certifications in AWS, Azure, GCP, AI, blockchain and application security.</w:t>
+      </w:r>
+    </w:p>
+    <w:p>
+      <w:pPr>
+        <w:pStyle w:val="ListParagraph"/>
+        <w:numPr>
+          <w:ilvl w:val="0"/>
+          <w:numId w:val="1"/>
+        </w:numPr>
+        <w:spacing w:after="40"/>
+      </w:pPr>
+      <w:r>
+        <w:rPr>
+          <w:b/>
+          <w:bCs/>
+          <w:sz w:val="19"/>
+          <w:szCs w:val="19"/>
+        </w:rPr>
+        <w:t xml:space="preserve">Mentorship and teaching: </w:t>
+      </w:r>
+      <w:r>
+        <w:rPr>
+          <w:sz w:val="19"/>
+          <w:szCs w:val="19"/>
+        </w:rPr>
+        <w:t xml:space="preserve">15 engineers mentored since 2019, six promoted to senior or lead roles. Volunteer instructor for a CodePath.org advanced algorithms cohort in 2024.</w:t>
       </w:r>
     </w:p>
     <w:sectPr>

</xml_diff>

<commit_message>
Resume: architecture, cloud, IaC and edge/reliability skills restored and led
</commit_message>
<xml_diff>
--- a/public/Eric_Gitangu_Resume.docx
+++ b/public/Eric_Gitangu_Resume.docx
@@ -41,7 +41,7 @@
         </w:rPr>
         <w:t xml:space="preserve">Nairobi, Kenya · </w:t>
       </w:r>
-      <w:hyperlink w:history="1" r:id="rIdozab6b3a2sd2bavhpvzwt">
+      <w:hyperlink w:history="1" r:id="rIdjx4uv3hfh20-acqc7fwxr">
         <w:r>
           <w:rPr>
             <w:color w:val="1A4EA3"/>
@@ -60,7 +60,7 @@
         </w:rPr>
         <w:t xml:space="preserve"> · </w:t>
       </w:r>
-      <w:hyperlink w:history="1" r:id="rIde0celchqku1cetglxql7y">
+      <w:hyperlink w:history="1" r:id="rIdaq7ihszffnv-0mpny9rcj">
         <w:r>
           <w:rPr>
             <w:color w:val="1A4EA3"/>
@@ -79,7 +79,7 @@
         </w:rPr>
         <w:t xml:space="preserve"> · +254 708 078 997 · </w:t>
       </w:r>
-      <w:hyperlink w:history="1" r:id="rIdvnl3_tkh0rofysfolgyqz">
+      <w:hyperlink w:history="1" r:id="rIdl4uhqki-z6gj-giodaj8h">
         <w:r>
           <w:rPr>
             <w:color w:val="1A4EA3"/>
@@ -98,7 +98,7 @@
         </w:rPr>
         <w:t xml:space="preserve"> · </w:t>
       </w:r>
-      <w:hyperlink w:history="1" r:id="rIdwcbnu6mi0vinfod4hkpqi">
+      <w:hyperlink w:history="1" r:id="rIdne7tq1d0v1jyupaonwv3n">
         <w:r>
           <w:rPr>
             <w:color w:val="1A4EA3"/>
@@ -117,7 +117,7 @@
         </w:rPr>
         <w:t xml:space="preserve"> · </w:t>
       </w:r>
-      <w:hyperlink w:history="1" r:id="rIdblj2ws54sv4grmxqowywr">
+      <w:hyperlink w:history="1" r:id="rId2sjhdeujhqhxtfrjjowxp">
         <w:r>
           <w:rPr>
             <w:color w:val="1A4EA3"/>
@@ -156,7 +156,7 @@
           <w:sz w:val="19"/>
           <w:szCs w:val="19"/>
         </w:rPr>
-        <w:t xml:space="preserve">Software engineer with 11 years in production systems across fintech, healthcare, energy access, logistics and application security. I currently own architecture and security for a multi-surface payments and mobility platform, a Mastercard partner, where I removed an authentication bypass, closed money-correctness defects, mapped the platform to payments compliance requirements, and built card and mobile money rails within PCI DSS scope. Before that I led platform and quality engineering for a pay-as-you-go solar company in seven African countries, founded an ML security company for medical device software, and led the team behind a digital addressing pilot with the Nairobi County Government. I design event-driven systems, plan for failure, instrument what I ship, and lead teams through review, mentoring and clear technical direction. TypeScript, Java, PHP, Python, Rust, Go and C#.</w:t>
+        <w:t xml:space="preserve">Software engineer with 11 years in production systems across fintech, healthcare, energy access, logistics and application security. I currently own architecture and security for a multi-surface payments and mobility platform, a Mastercard partner, where I removed an authentication bypass, closed money-correctness defects, mapped the platform to payments compliance requirements, and built card and mobile money rails within PCI DSS scope. Before that I led platform and quality engineering for a pay-as-you-go solar company in seven African countries, founded an ML security company for medical device software, and led the team behind a digital addressing pilot with the Nairobi County Government. I design event-driven systems, run the cloud and edge they live on (AWS, GCP, Azure, Cloudflare; Terraform and Ansible; nginx, load balancing, rate limiting, high availability), plan for failure, instrument what I ship, and lead teams through review, mentoring and clear technical direction. TypeScript, Java, PHP, Python, Rust, Go and C#.</w:t>
       </w:r>
     </w:p>
     <w:p>
@@ -1278,7 +1278,7 @@
         </w:rPr>
         <w:t xml:space="preserve"> · </w:t>
       </w:r>
-      <w:hyperlink w:history="1" r:id="rId8mssqxhwui0qlrsljmfvg">
+      <w:hyperlink w:history="1" r:id="rIdknqifrffwfyli2n8auj6l">
         <w:r>
           <w:rPr>
             <w:color w:val="1A4EA3"/>
@@ -1335,7 +1335,7 @@
         </w:rPr>
         <w:t xml:space="preserve"> · </w:t>
       </w:r>
-      <w:hyperlink w:history="1" r:id="rIdrrvsb-bct5o5zhb9dapym">
+      <w:hyperlink w:history="1" r:id="rIdpi10ufzxg8rd8zi7hassc">
         <w:r>
           <w:rPr>
             <w:color w:val="1A4EA3"/>
@@ -1392,7 +1392,7 @@
         </w:rPr>
         <w:t xml:space="preserve"> · </w:t>
       </w:r>
-      <w:hyperlink w:history="1" r:id="rIdlpg_e8g_vcng5orgfufws">
+      <w:hyperlink w:history="1" r:id="rIdoxzjgb0hfvf64e77kysyx">
         <w:r>
           <w:rPr>
             <w:color w:val="1A4EA3"/>
@@ -1488,7 +1488,7 @@
         </w:rPr>
         <w:t xml:space="preserve"> · </w:t>
       </w:r>
-      <w:hyperlink w:history="1" r:id="rIdudz4qgvylpvtm_-b3zxpd">
+      <w:hyperlink w:history="1" r:id="rIdvuvo-q23_jve2b-0vnvs9">
         <w:r>
           <w:rPr>
             <w:color w:val="1A4EA3"/>
@@ -1545,7 +1545,7 @@
         </w:rPr>
         <w:t xml:space="preserve"> · </w:t>
       </w:r>
-      <w:hyperlink w:history="1" r:id="rIdmqjyd0tkis4fxei6xagpf">
+      <w:hyperlink w:history="1" r:id="rIdyarc57pgnqz0_lngksw5c">
         <w:r>
           <w:rPr>
             <w:color w:val="1A4EA3"/>
@@ -1602,7 +1602,7 @@
         </w:rPr>
         <w:t xml:space="preserve"> · </w:t>
       </w:r>
-      <w:hyperlink w:history="1" r:id="rIddpqd1g6iqhybqq7wd30-z">
+      <w:hyperlink w:history="1" r:id="rIdsjqrch8di83yb8ye_bmvs">
         <w:r>
           <w:rPr>
             <w:color w:val="1A4EA3"/>
@@ -1675,7 +1675,7 @@
           <w:sz w:val="19"/>
           <w:szCs w:val="19"/>
         </w:rPr>
-        <w:t xml:space="preserve">Distributed Systems · Microservices · Event-Driven · CQRS · Event Sourcing · Resiliency &amp; Fault Tolerance · Hexagonal / Ports &amp; Adapters · DDD · Multi-tenant · API Design</w:t>
+        <w:t xml:space="preserve">Distributed systems · Microservices · Event-driven architecture · CQRS · Event sourcing · Saga orchestration · Hexagonal / ports and adapters · Domain-driven design · Backend-for-frontend · Multi-tenant SaaS · API design (REST, GraphQL, gRPC, OpenAPI) · Resiliency patterns (circuit breaker, back-off, idempotency) · Strangler-fig migration · Zero-trust auth · Scale-to-zero serverless design · Capacity and failure-mode analysis</w:t>
       </w:r>
     </w:p>
     <w:p>
@@ -1696,7 +1696,49 @@
           <w:sz w:val="19"/>
           <w:szCs w:val="19"/>
         </w:rPr>
-        <w:t xml:space="preserve">PCI DSS (SAQ-A) · Tokenization / hosted payment sessions · Idempotency &amp; fail-closed money paths · Settlement &amp; reconciliation · OAuth2/JWT · OWASP Top 10 · Secure SDLC / threat modelling · MFA (WebAuthn / TOTP) · Audit hash-chains · NIST SSDF</w:t>
+        <w:t xml:space="preserve">PCI DSS (SAQ-A) · Tokenization / hosted payment sessions · Idempotency &amp; fail-closed money paths · Settlement &amp; reconciliation · OAuth2/JWT · OWASP Top 10 · Secure SDLC / threat modelling · MFA (WebAuthn / TOTP) · Audit hash-chains · NIST SSDF · HIPAA · FHIR/HL7 · AES-256-GCM</w:t>
+      </w:r>
+    </w:p>
+    <w:p>
+      <w:pPr>
+        <w:spacing w:after="60"/>
+      </w:pPr>
+      <w:r>
+        <w:rPr>
+          <w:b/>
+          <w:bCs/>
+          <w:sz w:val="19"/>
+          <w:szCs w:val="19"/>
+        </w:rPr>
+        <w:t xml:space="preserve">Cloud &amp; DevOps: </w:t>
+      </w:r>
+      <w:r>
+        <w:rPr>
+          <w:sz w:val="19"/>
+          <w:szCs w:val="19"/>
+        </w:rPr>
+        <w:t xml:space="preserve">AWS · GCP · Azure · Cloudflare (Workers, DNS, CDN, WAF) · Vercel · Fly.io · Kubernetes · Docker · Terraform · Ansible · CloudFormation / CDK · GitHub Actions · GitLab CI · Jenkins · Atomic releases and rollback · Serverless (Lambda, Cloud Run, Workers)</w:t>
+      </w:r>
+    </w:p>
+    <w:p>
+      <w:pPr>
+        <w:spacing w:after="60"/>
+      </w:pPr>
+      <w:r>
+        <w:rPr>
+          <w:b/>
+          <w:bCs/>
+          <w:sz w:val="19"/>
+          <w:szCs w:val="19"/>
+        </w:rPr>
+        <w:t xml:space="preserve">Edge, Networking &amp; Reliability: </w:t>
+      </w:r>
+      <w:r>
+        <w:rPr>
+          <w:sz w:val="19"/>
+          <w:szCs w:val="19"/>
+        </w:rPr>
+        <w:t xml:space="preserve">Nginx reverse proxy and API gateway · Load balancing · High availability and failover · Rate limiting · TLS 1.2/1.3, HSTS, CSP · ModSecurity / OWASP CRS · fail2ban and SSH hardening · Prometheus · Grafana · Loki · OpenTelemetry · Jaeger · ELK · SLOs and error budgets · Chaos and load testing (K6, Locust) · Linux (Ubuntu, Debian)</w:t>
       </w:r>
     </w:p>
     <w:p>
@@ -1717,7 +1759,7 @@
           <w:sz w:val="19"/>
           <w:szCs w:val="19"/>
         </w:rPr>
-        <w:t xml:space="preserve">TypeScript · Node.js · Java · Spring Boot · PHP · Python · Rust · Go · C#/.NET · Kafka</w:t>
+        <w:t xml:space="preserve">TypeScript · Node.js · Java · Spring Boot · PHP · Python · Rust · Go · C#/.NET · Kafka · Scala · Clojure · C/C++ · Django · FastAPI · Groovy/Grails</w:t>
       </w:r>
     </w:p>
     <w:p>
@@ -1738,7 +1780,7 @@
           <w:sz w:val="19"/>
           <w:szCs w:val="19"/>
         </w:rPr>
-        <w:t xml:space="preserve">TensorFlow · PyTorch · LLMs · OpenAI · Anthropic Claude · Google Gemini · RAG Systems · CNNs · GNNs · Transformers</w:t>
+        <w:t xml:space="preserve">TensorFlow · PyTorch · LLMs · OpenAI · Anthropic Claude · Google Gemini · RAG Systems · CNNs · GNNs · Transformers · Apache Airflow · MLflow · Vertex AI · pgvector</w:t>
       </w:r>
     </w:p>
     <w:p>
@@ -1760,27 +1802,6 @@
           <w:szCs w:val="19"/>
         </w:rPr>
         <w:t xml:space="preserve">PostgreSQL · MongoDB · Redis · DynamoDB · MySQL · Kafka · RabbitMQ · Redshift · ETL/ELT Pipelines</w:t>
-      </w:r>
-    </w:p>
-    <w:p>
-      <w:pPr>
-        <w:spacing w:after="60"/>
-      </w:pPr>
-      <w:r>
-        <w:rPr>
-          <w:b/>
-          <w:bCs/>
-          <w:sz w:val="19"/>
-          <w:szCs w:val="19"/>
-        </w:rPr>
-        <w:t xml:space="preserve">Cloud &amp; DevOps: </w:t>
-      </w:r>
-      <w:r>
-        <w:rPr>
-          <w:sz w:val="19"/>
-          <w:szCs w:val="19"/>
-        </w:rPr>
-        <w:t xml:space="preserve">AWS · GCP · Azure · Kubernetes · Docker · Terraform · CI/CD · Atomic releases / rollback · Prometheus / Grafana / Loki · OpenTelemetry</w:t>
       </w:r>
     </w:p>
     <w:p>

</xml_diff>

<commit_message>
Resume PDF: Geist and Geist Mono embedded; skills on a new page; honours as bullets; nginx beside Cloudflare for edge
</commit_message>
<xml_diff>
--- a/public/Eric_Gitangu_Resume.docx
+++ b/public/Eric_Gitangu_Resume.docx
@@ -41,7 +41,7 @@
         </w:rPr>
         <w:t xml:space="preserve">Nairobi, Kenya · </w:t>
       </w:r>
-      <w:hyperlink w:history="1" r:id="rIdjx4uv3hfh20-acqc7fwxr">
+      <w:hyperlink w:history="1" r:id="rIdewqrhue3aix_fcatj2gr7">
         <w:r>
           <w:rPr>
             <w:color w:val="1A4EA3"/>
@@ -60,7 +60,7 @@
         </w:rPr>
         <w:t xml:space="preserve"> · </w:t>
       </w:r>
-      <w:hyperlink w:history="1" r:id="rIdaq7ihszffnv-0mpny9rcj">
+      <w:hyperlink w:history="1" r:id="rId9vsckj9v5eecud6toy2rd">
         <w:r>
           <w:rPr>
             <w:color w:val="1A4EA3"/>
@@ -79,7 +79,7 @@
         </w:rPr>
         <w:t xml:space="preserve"> · +254 708 078 997 · </w:t>
       </w:r>
-      <w:hyperlink w:history="1" r:id="rIdl4uhqki-z6gj-giodaj8h">
+      <w:hyperlink w:history="1" r:id="rIdzvnuh8yndszerxshxskyw">
         <w:r>
           <w:rPr>
             <w:color w:val="1A4EA3"/>
@@ -98,7 +98,7 @@
         </w:rPr>
         <w:t xml:space="preserve"> · </w:t>
       </w:r>
-      <w:hyperlink w:history="1" r:id="rIdne7tq1d0v1jyupaonwv3n">
+      <w:hyperlink w:history="1" r:id="rIdkiloxzrv9otilzs_09_vy">
         <w:r>
           <w:rPr>
             <w:color w:val="1A4EA3"/>
@@ -117,7 +117,7 @@
         </w:rPr>
         <w:t xml:space="preserve"> · </w:t>
       </w:r>
-      <w:hyperlink w:history="1" r:id="rId2sjhdeujhqhxtfrjjowxp">
+      <w:hyperlink w:history="1" r:id="rId9sgbbj2ric93uymydgk05">
         <w:r>
           <w:rPr>
             <w:color w:val="1A4EA3"/>
@@ -1278,7 +1278,7 @@
         </w:rPr>
         <w:t xml:space="preserve"> · </w:t>
       </w:r>
-      <w:hyperlink w:history="1" r:id="rIdknqifrffwfyli2n8auj6l">
+      <w:hyperlink w:history="1" r:id="rIdhjk7icmq-xyn6mrmndsiw">
         <w:r>
           <w:rPr>
             <w:color w:val="1A4EA3"/>
@@ -1335,7 +1335,7 @@
         </w:rPr>
         <w:t xml:space="preserve"> · </w:t>
       </w:r>
-      <w:hyperlink w:history="1" r:id="rIdpi10ufzxg8rd8zi7hassc">
+      <w:hyperlink w:history="1" r:id="rId5bfn11lx9jmf0lbjje3wn">
         <w:r>
           <w:rPr>
             <w:color w:val="1A4EA3"/>
@@ -1392,7 +1392,7 @@
         </w:rPr>
         <w:t xml:space="preserve"> · </w:t>
       </w:r>
-      <w:hyperlink w:history="1" r:id="rIdoxzjgb0hfvf64e77kysyx">
+      <w:hyperlink w:history="1" r:id="rIdfdxfzqmkwauqf39juo9i6">
         <w:r>
           <w:rPr>
             <w:color w:val="1A4EA3"/>
@@ -1488,7 +1488,7 @@
         </w:rPr>
         <w:t xml:space="preserve"> · </w:t>
       </w:r>
-      <w:hyperlink w:history="1" r:id="rIdvuvo-q23_jve2b-0vnvs9">
+      <w:hyperlink w:history="1" r:id="rIdar-lab3j52k1qsg3oft1j">
         <w:r>
           <w:rPr>
             <w:color w:val="1A4EA3"/>
@@ -1545,7 +1545,7 @@
         </w:rPr>
         <w:t xml:space="preserve"> · </w:t>
       </w:r>
-      <w:hyperlink w:history="1" r:id="rIdyarc57pgnqz0_lngksw5c">
+      <w:hyperlink w:history="1" r:id="rIdsbwfh9yp-ibfpo9gt13q2">
         <w:r>
           <w:rPr>
             <w:color w:val="1A4EA3"/>
@@ -1602,7 +1602,7 @@
         </w:rPr>
         <w:t xml:space="preserve"> · </w:t>
       </w:r>
-      <w:hyperlink w:history="1" r:id="rIdsjqrch8di83yb8ye_bmvs">
+      <w:hyperlink w:history="1" r:id="rIdpeogx5ocxbtmwp6mwlzfp">
         <w:r>
           <w:rPr>
             <w:color w:val="1A4EA3"/>
@@ -1717,21 +1717,21 @@
           <w:sz w:val="19"/>
           <w:szCs w:val="19"/>
         </w:rPr>
-        <w:t xml:space="preserve">AWS · GCP · Azure · Cloudflare (Workers, DNS, CDN, WAF) · Vercel · Fly.io · Kubernetes · Docker · Terraform · Ansible · CloudFormation / CDK · GitHub Actions · GitLab CI · Jenkins · Atomic releases and rollback · Serverless (Lambda, Cloud Run, Workers)</w:t>
-      </w:r>
-    </w:p>
-    <w:p>
-      <w:pPr>
-        <w:spacing w:after="60"/>
-      </w:pPr>
-      <w:r>
-        <w:rPr>
-          <w:b/>
-          <w:bCs/>
-          <w:sz w:val="19"/>
-          <w:szCs w:val="19"/>
-        </w:rPr>
-        <w:t xml:space="preserve">Edge, Networking &amp; Reliability: </w:t>
+        <w:t xml:space="preserve">AWS · GCP · Azure · Cloudflare (Workers, DNS, CDN, WAF) · Nginx (edge reverse proxy) · Vercel · Fly.io · Kubernetes · Docker · Terraform · Ansible · CloudFormation / CDK · GitHub Actions · GitLab CI · Jenkins · Atomic releases and rollback</w:t>
+      </w:r>
+    </w:p>
+    <w:p>
+      <w:pPr>
+        <w:spacing w:after="60"/>
+      </w:pPr>
+      <w:r>
+        <w:rPr>
+          <w:b/>
+          <w:bCs/>
+          <w:sz w:val="19"/>
+          <w:szCs w:val="19"/>
+        </w:rPr>
+        <w:t xml:space="preserve">Edge (Cloudflare, Nginx), Networking &amp; Reliability: </w:t>
       </w:r>
       <w:r>
         <w:rPr>
@@ -1893,7 +1893,58 @@
           <w:sz w:val="19"/>
           <w:szCs w:val="19"/>
         </w:rPr>
-        <w:t xml:space="preserve">Microsoft Scholar and Google Scholar. Dean's List for nine semesters. Omicron Delta Kappa.</w:t>
+        <w:t xml:space="preserve">Microsoft Scholarship, 2012 to 2013, for academic excellence in software engineering</w:t>
+      </w:r>
+    </w:p>
+    <w:p>
+      <w:pPr>
+        <w:pStyle w:val="ListParagraph"/>
+        <w:numPr>
+          <w:ilvl w:val="0"/>
+          <w:numId w:val="1"/>
+        </w:numPr>
+        <w:spacing w:after="30"/>
+      </w:pPr>
+      <w:r>
+        <w:rPr>
+          <w:sz w:val="19"/>
+          <w:szCs w:val="19"/>
+        </w:rPr>
+        <w:t xml:space="preserve">Google Scholarship, 2011 to 2012, for achievement in computer science coursework and research</w:t>
+      </w:r>
+    </w:p>
+    <w:p>
+      <w:pPr>
+        <w:pStyle w:val="ListParagraph"/>
+        <w:numPr>
+          <w:ilvl w:val="0"/>
+          <w:numId w:val="1"/>
+        </w:numPr>
+        <w:spacing w:after="30"/>
+      </w:pPr>
+      <w:r>
+        <w:rPr>
+          <w:sz w:val="19"/>
+          <w:szCs w:val="19"/>
+        </w:rPr>
+        <w:t xml:space="preserve">Dean's List, nine semesters, 2010 to 2015</w:t>
+      </w:r>
+    </w:p>
+    <w:p>
+      <w:pPr>
+        <w:pStyle w:val="ListParagraph"/>
+        <w:numPr>
+          <w:ilvl w:val="0"/>
+          <w:numId w:val="1"/>
+        </w:numPr>
+        <w:spacing w:after="30"/>
+      </w:pPr>
+      <w:r>
+        <w:rPr>
+          <w:sz w:val="19"/>
+          <w:szCs w:val="19"/>
+        </w:rPr>
+        <w:t xml:space="preserve">Omicron Delta Kappa National Leadership Honor Society</w:t>
       </w:r>
     </w:p>
     <w:p>

</xml_diff>

<commit_message>
Resume: senior title with broadened scope, set to read first
</commit_message>
<xml_diff>
--- a/public/Eric_Gitangu_Resume.docx
+++ b/public/Eric_Gitangu_Resume.docx
@@ -22,11 +22,13 @@
       </w:pPr>
       <w:r>
         <w:rPr>
-          <w:color w:val="444444"/>
-          <w:sz w:val="22"/>
-          <w:szCs w:val="22"/>
-        </w:rPr>
-        <w:t xml:space="preserve">Software Engineer, Payments Platforms and Distributed Systems</w:t>
+          <w:b/>
+          <w:bCs/>
+          <w:color w:val="1A1A1A"/>
+          <w:sz w:val="24"/>
+          <w:szCs w:val="24"/>
+        </w:rPr>
+        <w:t xml:space="preserve">Senior Software Engineer | Distributed Systems, Platform Architecture &amp; Security</w:t>
       </w:r>
     </w:p>
     <w:p>
@@ -41,7 +43,7 @@
         </w:rPr>
         <w:t xml:space="preserve">Nairobi, Kenya · </w:t>
       </w:r>
-      <w:hyperlink w:history="1" r:id="rIdewqrhue3aix_fcatj2gr7">
+      <w:hyperlink w:history="1" r:id="rIdlckhny-ff_whds1zlj_cf">
         <w:r>
           <w:rPr>
             <w:color w:val="1A4EA3"/>
@@ -60,7 +62,7 @@
         </w:rPr>
         <w:t xml:space="preserve"> · </w:t>
       </w:r>
-      <w:hyperlink w:history="1" r:id="rId9vsckj9v5eecud6toy2rd">
+      <w:hyperlink w:history="1" r:id="rIdpo30uxmcsa0r2ya_aaxbn">
         <w:r>
           <w:rPr>
             <w:color w:val="1A4EA3"/>
@@ -79,7 +81,7 @@
         </w:rPr>
         <w:t xml:space="preserve"> · +254 708 078 997 · </w:t>
       </w:r>
-      <w:hyperlink w:history="1" r:id="rIdzvnuh8yndszerxshxskyw">
+      <w:hyperlink w:history="1" r:id="rIdxmkeojzt4xhjrkhew3d5t">
         <w:r>
           <w:rPr>
             <w:color w:val="1A4EA3"/>
@@ -98,7 +100,7 @@
         </w:rPr>
         <w:t xml:space="preserve"> · </w:t>
       </w:r>
-      <w:hyperlink w:history="1" r:id="rIdkiloxzrv9otilzs_09_vy">
+      <w:hyperlink w:history="1" r:id="rIdcqyz-iyva8wyhsu7pkwig">
         <w:r>
           <w:rPr>
             <w:color w:val="1A4EA3"/>
@@ -117,7 +119,7 @@
         </w:rPr>
         <w:t xml:space="preserve"> · </w:t>
       </w:r>
-      <w:hyperlink w:history="1" r:id="rId9sgbbj2ric93uymydgk05">
+      <w:hyperlink w:history="1" r:id="rIddniv3cfhpsn3zwsf6m6uu">
         <w:r>
           <w:rPr>
             <w:color w:val="1A4EA3"/>
@@ -1278,7 +1280,7 @@
         </w:rPr>
         <w:t xml:space="preserve"> · </w:t>
       </w:r>
-      <w:hyperlink w:history="1" r:id="rIdhjk7icmq-xyn6mrmndsiw">
+      <w:hyperlink w:history="1" r:id="rIdzwy5sar4yjcy160jzeng5">
         <w:r>
           <w:rPr>
             <w:color w:val="1A4EA3"/>
@@ -1335,7 +1337,7 @@
         </w:rPr>
         <w:t xml:space="preserve"> · </w:t>
       </w:r>
-      <w:hyperlink w:history="1" r:id="rId5bfn11lx9jmf0lbjje3wn">
+      <w:hyperlink w:history="1" r:id="rId4g59z8ws8v1nkhtoun-cx">
         <w:r>
           <w:rPr>
             <w:color w:val="1A4EA3"/>
@@ -1392,7 +1394,7 @@
         </w:rPr>
         <w:t xml:space="preserve"> · </w:t>
       </w:r>
-      <w:hyperlink w:history="1" r:id="rIdfdxfzqmkwauqf39juo9i6">
+      <w:hyperlink w:history="1" r:id="rIdebyrbmogdnakxd44uvvs6">
         <w:r>
           <w:rPr>
             <w:color w:val="1A4EA3"/>
@@ -1488,7 +1490,7 @@
         </w:rPr>
         <w:t xml:space="preserve"> · </w:t>
       </w:r>
-      <w:hyperlink w:history="1" r:id="rIdar-lab3j52k1qsg3oft1j">
+      <w:hyperlink w:history="1" r:id="rId99jid0-gfbgnrteffb5gs">
         <w:r>
           <w:rPr>
             <w:color w:val="1A4EA3"/>
@@ -1545,7 +1547,7 @@
         </w:rPr>
         <w:t xml:space="preserve"> · </w:t>
       </w:r>
-      <w:hyperlink w:history="1" r:id="rIdsbwfh9yp-ibfpo9gt13q2">
+      <w:hyperlink w:history="1" r:id="rIduvebpmkdzru-7hm48opew">
         <w:r>
           <w:rPr>
             <w:color w:val="1A4EA3"/>
@@ -1602,7 +1604,7 @@
         </w:rPr>
         <w:t xml:space="preserve"> · </w:t>
       </w:r>
-      <w:hyperlink w:history="1" r:id="rIdpeogx5ocxbtmwp6mwlzfp">
+      <w:hyperlink w:history="1" r:id="rIdvjzgzpzqu7ypqmwhgv8nx">
         <w:r>
           <w:rPr>
             <w:color w:val="1A4EA3"/>

</xml_diff>